<commit_message>
Relatório: capa UMN/Ciências da Computação, epígrafe e numeração desde a Introdução
- Capa actualizada para Universidade Mandume ya Ndemufayo, Faculdade de
  Ciências da Computação (4.º ano).
- Epígrafe de anime após a capa (Senku Ishigami, Dr. Stone) sobre conhecimento.
- Numeração de páginas recomeça em 1 a partir da Introdução; parte pré-textual
  (capa, epígrafe, organograma, índice) sem número.
</commit_message>
<xml_diff>
--- a/docs/Relatorio_BASI.docx
+++ b/docs/Relatorio_BASI.docx
@@ -12,7 +12,7 @@
           <w:b/>
           <w:bCs/>
         </w:rPr>
-        <w:t xml:space="preserve">INSTITUTO SUPERIOR POLITÉCNICO DA HUÍLA</w:t>
+        <w:t xml:space="preserve">UNIVERSIDADE MANDUME YA NDEMUFAYO</w:t>
       </w:r>
     </w:p>
     <w:p>
@@ -21,7 +21,7 @@
         <w:jc w:val="center"/>
       </w:pPr>
       <w:r>
-        <w:t xml:space="preserve">Departamento de Ciências e Tecnologias</w:t>
+        <w:t xml:space="preserve">Faculdade de Ciências da Computação</w:t>
       </w:r>
     </w:p>
     <w:p>
@@ -30,7 +30,7 @@
         <w:jc w:val="center"/>
       </w:pPr>
       <w:r>
-        <w:t xml:space="preserve">Licenciatura em Engenharia Informática</w:t>
+        <w:t xml:space="preserve">Licenciatura em Ciências da Computação — 4.º ano</w:t>
       </w:r>
     </w:p>
     <w:p>
@@ -136,6 +136,45 @@
       </w:r>
       <w:r>
         <w:t xml:space="preserve">junho de 2026</w:t>
+      </w:r>
+    </w:p>
+    <w:p>
+      <w:r>
+        <w:br w:type="page"/>
+      </w:r>
+    </w:p>
+    <w:p>
+      <w:pPr>
+        <w:spacing w:before="3600"/>
+      </w:pPr>
+    </w:p>
+    <w:p>
+      <w:pPr>
+        <w:spacing w:after="160"/>
+        <w:jc w:val="center"/>
+      </w:pPr>
+      <w:r>
+        <w:rPr>
+          <w:i/>
+          <w:iCs/>
+          <w:color w:val="1F3864"/>
+          <w:sz w:val="28"/>
+          <w:szCs w:val="28"/>
+        </w:rPr>
+        <w:t xml:space="preserve">“A ciência é o conhecimento acumulado pela humanidade ao longo de milhares de anos.”</w:t>
+      </w:r>
+    </w:p>
+    <w:p>
+      <w:pPr>
+        <w:jc w:val="center"/>
+      </w:pPr>
+      <w:r>
+        <w:rPr>
+          <w:color w:val="595959"/>
+          <w:sz w:val="22"/>
+          <w:szCs w:val="22"/>
+        </w:rPr>
+        <w:t xml:space="preserve">— Senku Ishigami, Dr. Stone</w:t>
       </w:r>
     </w:p>
     <w:p>
@@ -941,9 +980,15 @@
       </w:sdtContent>
     </w:sdt>
     <w:p>
-      <w:r>
-        <w:br w:type="page"/>
-      </w:r>
+      <w:pPr>
+        <w:sectPr>
+          <w:footerReference w:type="default" r:id="rId7"/>
+          <w:pgSz w:w="12240" w:h="15840" w:orient="portrait"/>
+          <w:pgMar w:top="1440" w:right="1440" w:bottom="1440" w:left="1440" w:header="708" w:footer="708" w:gutter="0"/>
+          <w:pgNumType/>
+          <w:docGrid w:linePitch="360"/>
+        </w:sectPr>
+      </w:pPr>
     </w:p>
     <w:p>
       <w:pPr>
@@ -2583,10 +2628,10 @@
       </w:r>
     </w:p>
     <w:sectPr>
-      <w:footerReference w:type="default" r:id="rId7"/>
+      <w:footerReference w:type="default" r:id="rId8"/>
       <w:pgSz w:w="12240" w:h="15840" w:orient="portrait"/>
       <w:pgMar w:top="1440" w:right="1440" w:bottom="1440" w:left="1440" w:header="708" w:footer="708" w:gutter="0"/>
-      <w:pgNumType/>
+      <w:pgNumType w:start="1"/>
       <w:docGrid w:linePitch="360"/>
     </w:sectPr>
   </w:body>
@@ -2635,6 +2680,12 @@
 </file>
 
 <file path=word/footer1.xml><?xml version="1.0" encoding="utf-8"?>
+<w:ftr xmlns:wpc="http://schemas.microsoft.com/office/word/2010/wordprocessingCanvas" xmlns:mc="http://schemas.openxmlformats.org/markup-compatibility/2006" xmlns:o="urn:schemas-microsoft-com:office:office" xmlns:r="http://schemas.openxmlformats.org/officeDocument/2006/relationships" xmlns:m="http://schemas.openxmlformats.org/officeDocument/2006/math" xmlns:v="urn:schemas-microsoft-com:vml" xmlns:wp14="http://schemas.microsoft.com/office/word/2010/wordprocessingDrawing" xmlns:wp="http://schemas.openxmlformats.org/drawingml/2006/wordprocessingDrawing" xmlns:w10="urn:schemas-microsoft-com:office:word" xmlns:w="http://schemas.openxmlformats.org/wordprocessingml/2006/main" xmlns:w14="http://schemas.microsoft.com/office/word/2010/wordml" xmlns:w15="http://schemas.microsoft.com/office/word/2012/wordml" xmlns:wpg="http://schemas.microsoft.com/office/word/2010/wordprocessingGroup" xmlns:wpi="http://schemas.microsoft.com/office/word/2010/wordprocessingInk" xmlns:wne="http://schemas.microsoft.com/office/word/2006/wordml" xmlns:wps="http://schemas.microsoft.com/office/word/2010/wordprocessingShape">
+  <w:p/>
+</w:ftr>
+</file>
+
+<file path=word/footer2.xml><?xml version="1.0" encoding="utf-8"?>
 <w:ftr xmlns:wpc="http://schemas.microsoft.com/office/word/2010/wordprocessingCanvas" xmlns:mc="http://schemas.openxmlformats.org/markup-compatibility/2006" xmlns:o="urn:schemas-microsoft-com:office:office" xmlns:r="http://schemas.openxmlformats.org/officeDocument/2006/relationships" xmlns:m="http://schemas.openxmlformats.org/officeDocument/2006/math" xmlns:v="urn:schemas-microsoft-com:vml" xmlns:wp14="http://schemas.microsoft.com/office/word/2010/wordprocessingDrawing" xmlns:wp="http://schemas.openxmlformats.org/drawingml/2006/wordprocessingDrawing" xmlns:w10="urn:schemas-microsoft-com:office:word" xmlns:w="http://schemas.openxmlformats.org/wordprocessingml/2006/main" xmlns:w14="http://schemas.microsoft.com/office/word/2010/wordml" xmlns:w15="http://schemas.microsoft.com/office/word/2012/wordml" xmlns:wpg="http://schemas.microsoft.com/office/word/2010/wordprocessingGroup" xmlns:wpi="http://schemas.microsoft.com/office/word/2010/wordprocessingInk" xmlns:wne="http://schemas.microsoft.com/office/word/2006/wordml" xmlns:wps="http://schemas.microsoft.com/office/word/2010/wordprocessingShape">
   <w:p>
     <w:pPr>

</xml_diff>

<commit_message>
Relatório: capa inclui o Instituto Politécnico da Huíla
Alinha a identificação institucional do relatório com o rodapé do site.

Co-Authored-By: Claude Opus 4.7 <noreply@anthropic.com>
</commit_message>
<xml_diff>
--- a/docs/Relatorio_BASI.docx
+++ b/docs/Relatorio_BASI.docx
@@ -13,6 +13,15 @@
           <w:bCs/>
         </w:rPr>
         <w:t xml:space="preserve">UNIVERSIDADE MANDUME YA NDEMUFAYO</w:t>
+      </w:r>
+    </w:p>
+    <w:p>
+      <w:pPr>
+        <w:spacing w:after="120" w:line="276"/>
+        <w:jc w:val="center"/>
+      </w:pPr>
+      <w:r>
+        <w:t xml:space="preserve">Instituto Politécnico da Huíla</w:t>
       </w:r>
     </w:p>
     <w:p>

</xml_diff>

<commit_message>
Relatório: capturas e snippets, estrutura alinhada ao enunciado
Reforça o grafo de conhecimento (12 documentos, hierarquia de temas a 3
níveis, citações e ligações entre áreas), embute capturas de ecrã e
excertos de código reais no relatório, reordena as secções conforme o
enunciado e corrige o nome da instituição (Instituto Superior).

Co-Authored-By: Claude Opus 4.7 <noreply@anthropic.com>
</commit_message>
<xml_diff>
--- a/docs/Relatorio_BASI.docx
+++ b/docs/Relatorio_BASI.docx
@@ -12,7 +12,7 @@
           <w:b/>
           <w:bCs/>
         </w:rPr>
-        <w:t xml:space="preserve">UNIVERSIDADE MANDUME YA NDEMUFAYO</w:t>
+        <w:t xml:space="preserve">INSTITUTO SUPERIOR POLITÉCNICO DA HUÍLA</w:t>
       </w:r>
     </w:p>
     <w:p>
@@ -21,7 +21,7 @@
         <w:jc w:val="center"/>
       </w:pPr>
       <w:r>
-        <w:t xml:space="preserve">Instituto Politécnico da Huíla</w:t>
+        <w:t xml:space="preserve">Universidade Mandume ya Ndemufayo</w:t>
       </w:r>
     </w:p>
     <w:p>
@@ -30,7 +30,7 @@
         <w:jc w:val="center"/>
       </w:pPr>
       <w:r>
-        <w:t xml:space="preserve">Faculdade de Ciências da Computação</w:t>
+        <w:t xml:space="preserve">Licenciatura em Ciências da Computação — 4.º ano</w:t>
       </w:r>
     </w:p>
     <w:p>
@@ -39,7 +39,7 @@
         <w:jc w:val="center"/>
       </w:pPr>
       <w:r>
-        <w:t xml:space="preserve">Licenciatura em Ciências da Computação — 4.º ano</w:t>
+        <w:t xml:space="preserve">Disciplina: Web Semântica</w:t>
       </w:r>
     </w:p>
     <w:p>
@@ -48,7 +48,7 @@
         <w:jc w:val="center"/>
       </w:pPr>
       <w:r>
-        <w:t xml:space="preserve">Disciplina de Web Semântica</w:t>
+        <w:t xml:space="preserve">Docente: Faby Sapeth</w:t>
       </w:r>
     </w:p>
     <w:p>
@@ -1012,7 +1012,7 @@
         <w:spacing w:after="120" w:line="276"/>
       </w:pPr>
       <w:r>
-        <w:t xml:space="preserve">Este relatório descreve a concepção e a implementação do Semantic Academic Hub (BASI), uma biblioteca académica que aplica tecnologias de Web Semântica para ligar obras, autores, áreas científicas e temas de investigação. O objectivo central é demonstrar, de forma realista e funcional, como uma ontologia OWL e o motor de inferência do Apache Jena Fuseki transformam uma biblioteca digital comum numa plataforma capaz de compreender as relações entre conceitos.</w:t>
+        <w:t xml:space="preserve">Este relatório descreve a concepção e a implementação do Semantic Academic Hub (BASI), uma biblioteca académica que aplica tecnologias de Web Semântica para ligar obras, autores, áreas científicas e temas de investigação. O objectivo central é demonstrar, de forma realista e funcional, como uma ontologia OWL e a inferência sobre um grafo RDF (Apache Jena Fuseki, com motor rdflib como alternativa) transformam uma biblioteca digital comum numa plataforma capaz de compreender as relações entre conceitos.</w:t>
       </w:r>
     </w:p>
     <w:p>
@@ -1020,7 +1020,77 @@
         <w:spacing w:after="120" w:line="276"/>
       </w:pPr>
       <w:r>
-        <w:t xml:space="preserve">Ao longo do documento apresentam-se o problema que motivou o trabalho, os objectivos, a fundamentação teórica, a modelação da ontologia e da base relacional, a arquitectura adoptada, as tecnologias utilizadas, os detalhes de implementação, os resultados obtidos, as dificuldades encontradas e as conclusões.</w:t>
+        <w:t xml:space="preserve">A figura seguinte apresenta a página inicial da aplicação, que comunica desde logo o diferencial do sistema: uma pesquisa que compreende o que se procura.</w:t>
+      </w:r>
+    </w:p>
+    <w:p>
+      <w:pPr>
+        <w:spacing w:after="40" w:before="120"/>
+        <w:jc w:val="center"/>
+      </w:pPr>
+      <w:r>
+        <w:drawing>
+          <wp:inline distT="0" distB="0" distL="0" distR="0">
+            <wp:extent cx="3619500" cy="4933950"/>
+            <wp:effectExtent t="0" r="0" b="0" l="0"/>
+            <wp:docPr id="1" name="home.png" descr="Figura 1 — Página inicial do BASI, com demonstração da pesquisa semântica." title="Figura 1 — Página inicial do BASI, com demonstração da pesquisa semântica."/>
+            <wp:cNvGraphicFramePr>
+              <a:graphicFrameLocks xmlns:a="http://schemas.openxmlformats.org/drawingml/2006/main" noChangeAspect="1"/>
+            </wp:cNvGraphicFramePr>
+            <a:graphic xmlns:a="http://schemas.openxmlformats.org/drawingml/2006/main">
+              <a:graphicData uri="http://schemas.openxmlformats.org/drawingml/2006/picture">
+                <pic:pic xmlns:pic="http://schemas.openxmlformats.org/drawingml/2006/picture">
+                  <pic:nvPicPr>
+                    <pic:cNvPr id="0" name="" descr=""/>
+                    <pic:cNvPicPr>
+                      <a:picLocks noChangeAspect="1" noChangeArrowheads="1"/>
+                    </pic:cNvPicPr>
+                  </pic:nvPicPr>
+                  <pic:blipFill>
+                    <a:blip r:embed="rId9" cstate="none"/>
+                    <a:srcRect/>
+                    <a:stretch>
+                      <a:fillRect/>
+                    </a:stretch>
+                  </pic:blipFill>
+                  <pic:spPr bwMode="auto">
+                    <a:xfrm>
+                      <a:off x="0" y="0"/>
+                      <a:ext cx="3619500" cy="4933950"/>
+                    </a:xfrm>
+                    <a:prstGeom prst="rect">
+                      <a:avLst/>
+                    </a:prstGeom>
+                  </pic:spPr>
+                </pic:pic>
+              </a:graphicData>
+            </a:graphic>
+          </wp:inline>
+        </w:drawing>
+      </w:r>
+    </w:p>
+    <w:p>
+      <w:pPr>
+        <w:spacing w:after="200"/>
+        <w:jc w:val="center"/>
+      </w:pPr>
+      <w:r>
+        <w:rPr>
+          <w:i/>
+          <w:iCs/>
+          <w:color w:val="595959"/>
+          <w:sz w:val="18"/>
+          <w:szCs w:val="18"/>
+        </w:rPr>
+        <w:t xml:space="preserve">Figura 1 — Página inicial do BASI, com demonstração da pesquisa semântica.</w:t>
+      </w:r>
+    </w:p>
+    <w:p>
+      <w:pPr>
+        <w:spacing w:after="120" w:line="276"/>
+      </w:pPr>
+      <w:r>
+        <w:t xml:space="preserve">Ao longo do documento apresentam-se o problema que motivou o trabalho, os objectivos, a fundamentação teórica, a modelação da ontologia, a arquitectura adoptada, as tecnologias utilizadas, os detalhes de implementação, os resultados obtidos, as dificuldades encontradas e as conclusões.</w:t>
       </w:r>
     </w:p>
     <w:p>
@@ -1044,7 +1114,7 @@
         <w:spacing w:after="120" w:line="276"/>
       </w:pPr>
       <w:r>
-        <w:t xml:space="preserve">A motivação do projecto é eliminar esta limitação: representar o conhecimento num grafo onde as relações são explícitas e onde o motor pode inferir factos que não foram escritos directamente. Se Deep Learning é subtema de Machine Learning, e este é subtema de Inteligência Artificial, então um documento de Deep Learning também é relevante para uma pesquisa por Inteligência Artificial.</w:t>
+        <w:t xml:space="preserve">A motivação do projecto é eliminar esta limitação: representar o conhecimento num grafo onde as relações são explícitas e onde o motor pode inferir factos que não foram escritos directamente. Se Deep Learning é subtema de Machine Learning, e este é subtema de Inteligência Artificial, então um documento de Deep Learning também é relevante para uma pesquisa por Inteligência Artificial. Esta é exactamente a problemática do Tema 1 do enunciado: descobrir relações entre obras, autores, áreas científicas e temas de investigação.</w:t>
       </w:r>
     </w:p>
     <w:p>
@@ -1343,6 +1413,26 @@
     </w:p>
     <w:p>
       <w:pPr>
+        <w:pStyle w:val="ListParagraph"/>
+        <w:numPr>
+          <w:ilvl w:val="0"/>
+          <w:numId w:val="2"/>
+        </w:numPr>
+        <w:spacing w:after="60"/>
+      </w:pPr>
+      <w:r>
+        <w:rPr>
+          <w:b/>
+          <w:bCs/>
+        </w:rPr>
+        <w:t xml:space="preserve">Funcional </w:t>
+      </w:r>
+      <w:r>
+        <w:t xml:space="preserve">(email): cada pessoa tem, no máximo, um valor para esta propriedade.</w:t>
+      </w:r>
+    </w:p>
+    <w:p>
+      <w:pPr>
         <w:pStyle w:val="Heading1"/>
       </w:pPr>
       <w:r>
@@ -1490,7 +1580,7 @@
         <w:pStyle w:val="Heading1"/>
       </w:pPr>
       <w:r>
-        <w:t xml:space="preserve">6. Arquitectura do Sistema</w:t>
+        <w:t xml:space="preserve">6. Modelação da Ontologia (OWL)</w:t>
       </w:r>
     </w:p>
     <w:p>
@@ -1498,6 +1588,588 @@
         <w:spacing w:after="120" w:line="276"/>
       </w:pPr>
       <w:r>
+        <w:t xml:space="preserve">A ontologia (ontology/basi.ttl) define a hierarquia de classes Pessoa → Autor → {Professor, Estudante, Investigador}, as subclasses de Documento (Livro, Artigo, Tese, Monografia, Manual, Apresentação, Material Didáctico) e as classes AreaCientifica, Tema, Genero e PalavraChave.</w:t>
+      </w:r>
+    </w:p>
+    <w:p>
+      <w:pPr>
+        <w:spacing w:after="120" w:line="276"/>
+      </w:pPr>
+      <w:r>
+        <w:t xml:space="preserve">As relações entre indivíduos são modeladas como propriedades de objecto, com os axiomas OWL que habilitam a inferência. O excerto seguinte mostra as três propriedades fundamentais — transitiva, simétrica e inversa:</w:t>
+      </w:r>
+    </w:p>
+    <w:p>
+      <w:pPr>
+        <w:shd w:fill="F2F2F2" w:val="clear"/>
+        <w:spacing w:after="0"/>
+      </w:pPr>
+      <w:r>
+        <w:rPr>
+          <w:rFonts w:ascii="Consolas" w:cs="Consolas" w:eastAsia="Consolas" w:hAnsi="Consolas"/>
+          <w:sz w:val="18"/>
+          <w:szCs w:val="18"/>
+        </w:rPr>
+        <w:t xml:space="preserve"># Propriedade TRANSITIVA — base da expansão de temas</w:t>
+      </w:r>
+    </w:p>
+    <w:p>
+      <w:pPr>
+        <w:shd w:fill="F2F2F2" w:val="clear"/>
+        <w:spacing w:after="0"/>
+      </w:pPr>
+      <w:r>
+        <w:rPr>
+          <w:rFonts w:ascii="Consolas" w:cs="Consolas" w:eastAsia="Consolas" w:hAnsi="Consolas"/>
+          <w:sz w:val="18"/>
+          <w:szCs w:val="18"/>
+        </w:rPr>
+        <w:t xml:space="preserve">basi:eSubtemaDe a owl:ObjectProperty, owl:TransitiveProperty ;</w:t>
+      </w:r>
+    </w:p>
+    <w:p>
+      <w:pPr>
+        <w:shd w:fill="F2F2F2" w:val="clear"/>
+        <w:spacing w:after="0"/>
+      </w:pPr>
+      <w:r>
+        <w:rPr>
+          <w:rFonts w:ascii="Consolas" w:cs="Consolas" w:eastAsia="Consolas" w:hAnsi="Consolas"/>
+          <w:sz w:val="18"/>
+          <w:szCs w:val="18"/>
+        </w:rPr>
+        <w:t xml:space="preserve">    rdfs:domain basi:Tema ; rdfs:range basi:Tema .</w:t>
+      </w:r>
+    </w:p>
+    <w:p>
+      <w:pPr>
+        <w:shd w:fill="F2F2F2" w:val="clear"/>
+        <w:spacing w:after="0"/>
+      </w:pPr>
+      <w:r>
+        <w:rPr>
+          <w:rFonts w:ascii="Consolas" w:cs="Consolas" w:eastAsia="Consolas" w:hAnsi="Consolas"/>
+          <w:sz w:val="18"/>
+          <w:szCs w:val="18"/>
+        </w:rPr>
+        <w:t xml:space="preserve"> </w:t>
+      </w:r>
+    </w:p>
+    <w:p>
+      <w:pPr>
+        <w:shd w:fill="F2F2F2" w:val="clear"/>
+        <w:spacing w:after="0"/>
+      </w:pPr>
+      <w:r>
+        <w:rPr>
+          <w:rFonts w:ascii="Consolas" w:cs="Consolas" w:eastAsia="Consolas" w:hAnsi="Consolas"/>
+          <w:sz w:val="18"/>
+          <w:szCs w:val="18"/>
+        </w:rPr>
+        <w:t xml:space="preserve"># Propriedade SIMÉTRICA — relação entre obras</w:t>
+      </w:r>
+    </w:p>
+    <w:p>
+      <w:pPr>
+        <w:shd w:fill="F2F2F2" w:val="clear"/>
+        <w:spacing w:after="0"/>
+      </w:pPr>
+      <w:r>
+        <w:rPr>
+          <w:rFonts w:ascii="Consolas" w:cs="Consolas" w:eastAsia="Consolas" w:hAnsi="Consolas"/>
+          <w:sz w:val="18"/>
+          <w:szCs w:val="18"/>
+        </w:rPr>
+        <w:t xml:space="preserve">basi:obraRelacionada a owl:ObjectProperty, owl:SymmetricProperty ;</w:t>
+      </w:r>
+    </w:p>
+    <w:p>
+      <w:pPr>
+        <w:shd w:fill="F2F2F2" w:val="clear"/>
+        <w:spacing w:after="0"/>
+      </w:pPr>
+      <w:r>
+        <w:rPr>
+          <w:rFonts w:ascii="Consolas" w:cs="Consolas" w:eastAsia="Consolas" w:hAnsi="Consolas"/>
+          <w:sz w:val="18"/>
+          <w:szCs w:val="18"/>
+        </w:rPr>
+        <w:t xml:space="preserve">    rdfs:domain basi:Documento ; rdfs:range basi:Documento .</w:t>
+      </w:r>
+    </w:p>
+    <w:p>
+      <w:pPr>
+        <w:shd w:fill="F2F2F2" w:val="clear"/>
+        <w:spacing w:after="0"/>
+      </w:pPr>
+      <w:r>
+        <w:rPr>
+          <w:rFonts w:ascii="Consolas" w:cs="Consolas" w:eastAsia="Consolas" w:hAnsi="Consolas"/>
+          <w:sz w:val="18"/>
+          <w:szCs w:val="18"/>
+        </w:rPr>
+        <w:t xml:space="preserve"> </w:t>
+      </w:r>
+    </w:p>
+    <w:p>
+      <w:pPr>
+        <w:shd w:fill="F2F2F2" w:val="clear"/>
+        <w:spacing w:after="0"/>
+      </w:pPr>
+      <w:r>
+        <w:rPr>
+          <w:rFonts w:ascii="Consolas" w:cs="Consolas" w:eastAsia="Consolas" w:hAnsi="Consolas"/>
+          <w:sz w:val="18"/>
+          <w:szCs w:val="18"/>
+        </w:rPr>
+        <w:t xml:space="preserve"># Propriedade INVERSA — autoria navegável nos dois sentidos</w:t>
+      </w:r>
+    </w:p>
+    <w:p>
+      <w:pPr>
+        <w:shd w:fill="F2F2F2" w:val="clear"/>
+        <w:spacing w:after="0"/>
+      </w:pPr>
+      <w:r>
+        <w:rPr>
+          <w:rFonts w:ascii="Consolas" w:cs="Consolas" w:eastAsia="Consolas" w:hAnsi="Consolas"/>
+          <w:sz w:val="18"/>
+          <w:szCs w:val="18"/>
+        </w:rPr>
+        <w:t xml:space="preserve">basi:temAutor a owl:ObjectProperty ;</w:t>
+      </w:r>
+    </w:p>
+    <w:p>
+      <w:pPr>
+        <w:shd w:fill="F2F2F2" w:val="clear"/>
+        <w:spacing w:after="120"/>
+      </w:pPr>
+      <w:r>
+        <w:rPr>
+          <w:rFonts w:ascii="Consolas" w:cs="Consolas" w:eastAsia="Consolas" w:hAnsi="Consolas"/>
+          <w:sz w:val="18"/>
+          <w:szCs w:val="18"/>
+        </w:rPr>
+        <w:t xml:space="preserve">    owl:inverseOf basi:ehAutorDe .</w:t>
+      </w:r>
+    </w:p>
+    <w:p>
+      <w:pPr>
+        <w:spacing w:after="120" w:line="276"/>
+      </w:pPr>
+      <w:r>
+        <w:t xml:space="preserve">A ontologia inclui ainda restrições OWL e classes inferidas: por owl:Restriction exige-se que cada Documento tenha pelo menos um autor (cardinalidade mínima 1); por owl:equivalentClass define-se DocumentoDeIA (qualquer documento cujo tema seja Inteligência Artificial ou um seu subtema) e ProfessorActivo (professor autor de pelo menos um documento). O axioma owl:AllDisjointClasses garante que um documento não pode ser, em simultâneo, Livro e Tese. A CDU é modelada como um skos:ConceptScheme, em que cada secção e género é um skos:Concept.</w:t>
+      </w:r>
+    </w:p>
+    <w:p>
+      <w:pPr>
+        <w:pStyle w:val="Heading1"/>
+      </w:pPr>
+      <w:r>
+        <w:t xml:space="preserve">7. Base de Conhecimento e Consultas SPARQL</w:t>
+      </w:r>
+    </w:p>
+    <w:p>
+      <w:pPr>
+        <w:spacing w:after="120" w:line="276"/>
+      </w:pPr>
+      <w:r>
+        <w:t xml:space="preserve">A base de conhecimento (rdf/dados_exemplo.ttl) materializa as instâncias (ABox): áreas científicas, uma hierarquia de temas com três níveis de profundidade, autores, doze documentos técnicos e as relações entre eles (autoria, tema, citações e obras relacionadas). O excerto abaixo ilustra como a hierarquia de temas e a classificação de um documento são declaradas em triplos RDF:</w:t>
+      </w:r>
+    </w:p>
+    <w:p>
+      <w:pPr>
+        <w:shd w:fill="F2F2F2" w:val="clear"/>
+        <w:spacing w:after="0"/>
+      </w:pPr>
+      <w:r>
+        <w:rPr>
+          <w:rFonts w:ascii="Consolas" w:cs="Consolas" w:eastAsia="Consolas" w:hAnsi="Consolas"/>
+          <w:sz w:val="18"/>
+          <w:szCs w:val="18"/>
+        </w:rPr>
+        <w:t xml:space="preserve">basi:Tema_DeepLearning a basi:Tema ;</w:t>
+      </w:r>
+    </w:p>
+    <w:p>
+      <w:pPr>
+        <w:shd w:fill="F2F2F2" w:val="clear"/>
+        <w:spacing w:after="0"/>
+      </w:pPr>
+      <w:r>
+        <w:rPr>
+          <w:rFonts w:ascii="Consolas" w:cs="Consolas" w:eastAsia="Consolas" w:hAnsi="Consolas"/>
+          <w:sz w:val="18"/>
+          <w:szCs w:val="18"/>
+        </w:rPr>
+        <w:t xml:space="preserve">    basi:nome "Deep Learning" ;</w:t>
+      </w:r>
+    </w:p>
+    <w:p>
+      <w:pPr>
+        <w:shd w:fill="F2F2F2" w:val="clear"/>
+        <w:spacing w:after="0"/>
+      </w:pPr>
+      <w:r>
+        <w:rPr>
+          <w:rFonts w:ascii="Consolas" w:cs="Consolas" w:eastAsia="Consolas" w:hAnsi="Consolas"/>
+          <w:sz w:val="18"/>
+          <w:szCs w:val="18"/>
+        </w:rPr>
+        <w:t xml:space="preserve">    basi:eSubtemaDe basi:Tema_MachineLearning .</w:t>
+      </w:r>
+    </w:p>
+    <w:p>
+      <w:pPr>
+        <w:shd w:fill="F2F2F2" w:val="clear"/>
+        <w:spacing w:after="0"/>
+      </w:pPr>
+      <w:r>
+        <w:rPr>
+          <w:rFonts w:ascii="Consolas" w:cs="Consolas" w:eastAsia="Consolas" w:hAnsi="Consolas"/>
+          <w:sz w:val="18"/>
+          <w:szCs w:val="18"/>
+        </w:rPr>
+        <w:t xml:space="preserve"> </w:t>
+      </w:r>
+    </w:p>
+    <w:p>
+      <w:pPr>
+        <w:shd w:fill="F2F2F2" w:val="clear"/>
+        <w:spacing w:after="0"/>
+      </w:pPr>
+      <w:r>
+        <w:rPr>
+          <w:rFonts w:ascii="Consolas" w:cs="Consolas" w:eastAsia="Consolas" w:hAnsi="Consolas"/>
+          <w:sz w:val="18"/>
+          <w:szCs w:val="18"/>
+        </w:rPr>
+        <w:t xml:space="preserve">rec:documento/doc2 a basi:Artigo ;</w:t>
+      </w:r>
+    </w:p>
+    <w:p>
+      <w:pPr>
+        <w:shd w:fill="F2F2F2" w:val="clear"/>
+        <w:spacing w:after="0"/>
+      </w:pPr>
+      <w:r>
+        <w:rPr>
+          <w:rFonts w:ascii="Consolas" w:cs="Consolas" w:eastAsia="Consolas" w:hAnsi="Consolas"/>
+          <w:sz w:val="18"/>
+          <w:szCs w:val="18"/>
+        </w:rPr>
+        <w:t xml:space="preserve">    basi:titulo "Aprendizagem Profunda Aplicada" ;</w:t>
+      </w:r>
+    </w:p>
+    <w:p>
+      <w:pPr>
+        <w:shd w:fill="F2F2F2" w:val="clear"/>
+        <w:spacing w:after="0"/>
+      </w:pPr>
+      <w:r>
+        <w:rPr>
+          <w:rFonts w:ascii="Consolas" w:cs="Consolas" w:eastAsia="Consolas" w:hAnsi="Consolas"/>
+          <w:sz w:val="18"/>
+          <w:szCs w:val="18"/>
+        </w:rPr>
+        <w:t xml:space="preserve">    basi:temTema basi:Tema_DeepLearning ;</w:t>
+      </w:r>
+    </w:p>
+    <w:p>
+      <w:pPr>
+        <w:shd w:fill="F2F2F2" w:val="clear"/>
+        <w:spacing w:after="120"/>
+      </w:pPr>
+      <w:r>
+        <w:rPr>
+          <w:rFonts w:ascii="Consolas" w:cs="Consolas" w:eastAsia="Consolas" w:hAnsi="Consolas"/>
+          <w:sz w:val="18"/>
+          <w:szCs w:val="18"/>
+        </w:rPr>
+        <w:t xml:space="preserve">    basi:temAutor rec:pessoa/adriano .</w:t>
+      </w:r>
+    </w:p>
+    <w:p>
+      <w:pPr>
+        <w:spacing w:after="120" w:line="276"/>
+      </w:pPr>
+      <w:r>
+        <w:t xml:space="preserve">A consulta-chave da pesquisa semântica usa um caminho de propriedade transitivo (eSubtemaDe*) para percorrer toda a sub-árvore de um tema e devolver os documentos a ele ligados, mesmo que o título não contenha a palavra pesquisada:</w:t>
+      </w:r>
+    </w:p>
+    <w:p>
+      <w:pPr>
+        <w:shd w:fill="F2F2F2" w:val="clear"/>
+        <w:spacing w:after="0"/>
+      </w:pPr>
+      <w:r>
+        <w:rPr>
+          <w:rFonts w:ascii="Consolas" w:cs="Consolas" w:eastAsia="Consolas" w:hAnsi="Consolas"/>
+          <w:sz w:val="18"/>
+          <w:szCs w:val="18"/>
+        </w:rPr>
+        <w:t xml:space="preserve">SELECT DISTINCT ?titulo WHERE {</w:t>
+      </w:r>
+    </w:p>
+    <w:p>
+      <w:pPr>
+        <w:shd w:fill="F2F2F2" w:val="clear"/>
+        <w:spacing w:after="0"/>
+      </w:pPr>
+      <w:r>
+        <w:rPr>
+          <w:rFonts w:ascii="Consolas" w:cs="Consolas" w:eastAsia="Consolas" w:hAnsi="Consolas"/>
+          <w:sz w:val="18"/>
+          <w:szCs w:val="18"/>
+        </w:rPr>
+        <w:t xml:space="preserve">  ?temaRaiz basi:nome "Inteligência Artificial" .</w:t>
+      </w:r>
+    </w:p>
+    <w:p>
+      <w:pPr>
+        <w:shd w:fill="F2F2F2" w:val="clear"/>
+        <w:spacing w:after="0"/>
+      </w:pPr>
+      <w:r>
+        <w:rPr>
+          <w:rFonts w:ascii="Consolas" w:cs="Consolas" w:eastAsia="Consolas" w:hAnsi="Consolas"/>
+          <w:sz w:val="18"/>
+          <w:szCs w:val="18"/>
+        </w:rPr>
+        <w:t xml:space="preserve">  ?tema basi:eSubtemaDe* ?temaRaiz .</w:t>
+      </w:r>
+    </w:p>
+    <w:p>
+      <w:pPr>
+        <w:shd w:fill="F2F2F2" w:val="clear"/>
+        <w:spacing w:after="0"/>
+      </w:pPr>
+      <w:r>
+        <w:rPr>
+          <w:rFonts w:ascii="Consolas" w:cs="Consolas" w:eastAsia="Consolas" w:hAnsi="Consolas"/>
+          <w:sz w:val="18"/>
+          <w:szCs w:val="18"/>
+        </w:rPr>
+        <w:t xml:space="preserve">  ?doc  basi:temTema ?tema ;</w:t>
+      </w:r>
+    </w:p>
+    <w:p>
+      <w:pPr>
+        <w:shd w:fill="F2F2F2" w:val="clear"/>
+        <w:spacing w:after="0"/>
+      </w:pPr>
+      <w:r>
+        <w:rPr>
+          <w:rFonts w:ascii="Consolas" w:cs="Consolas" w:eastAsia="Consolas" w:hAnsi="Consolas"/>
+          <w:sz w:val="18"/>
+          <w:szCs w:val="18"/>
+        </w:rPr>
+        <w:t xml:space="preserve">        basi:titulo  ?titulo .</w:t>
+      </w:r>
+    </w:p>
+    <w:p>
+      <w:pPr>
+        <w:shd w:fill="F2F2F2" w:val="clear"/>
+        <w:spacing w:after="120"/>
+      </w:pPr>
+      <w:r>
+        <w:rPr>
+          <w:rFonts w:ascii="Consolas" w:cs="Consolas" w:eastAsia="Consolas" w:hAnsi="Consolas"/>
+          <w:sz w:val="18"/>
+          <w:szCs w:val="18"/>
+        </w:rPr>
+        <w:t xml:space="preserve">}</w:t>
+      </w:r>
+    </w:p>
+    <w:p>
+      <w:pPr>
+        <w:spacing w:after="120" w:line="276"/>
+      </w:pPr>
+      <w:r>
+        <w:t xml:space="preserve">Esta consulta é gerada e executada pelo backend, no ServicoSemantico, demonstrando a integração entre a aplicação e a componente semântica:</w:t>
+      </w:r>
+    </w:p>
+    <w:p>
+      <w:pPr>
+        <w:shd w:fill="F2F2F2" w:val="clear"/>
+        <w:spacing w:after="0"/>
+      </w:pPr>
+      <w:r>
+        <w:rPr>
+          <w:rFonts w:ascii="Consolas" w:cs="Consolas" w:eastAsia="Consolas" w:hAnsi="Consolas"/>
+          <w:sz w:val="18"/>
+          <w:szCs w:val="18"/>
+        </w:rPr>
+        <w:t xml:space="preserve">def expandir_termo(self, termo: str) -&gt; list[str]:</w:t>
+      </w:r>
+    </w:p>
+    <w:p>
+      <w:pPr>
+        <w:shd w:fill="F2F2F2" w:val="clear"/>
+        <w:spacing w:after="0"/>
+      </w:pPr>
+      <w:r>
+        <w:rPr>
+          <w:rFonts w:ascii="Consolas" w:cs="Consolas" w:eastAsia="Consolas" w:hAnsi="Consolas"/>
+          <w:sz w:val="18"/>
+          <w:szCs w:val="18"/>
+        </w:rPr>
+        <w:t xml:space="preserve">    nomes: list[str] = []</w:t>
+      </w:r>
+    </w:p>
+    <w:p>
+      <w:pPr>
+        <w:shd w:fill="F2F2F2" w:val="clear"/>
+        <w:spacing w:after="0"/>
+      </w:pPr>
+      <w:r>
+        <w:rPr>
+          <w:rFonts w:ascii="Consolas" w:cs="Consolas" w:eastAsia="Consolas" w:hAnsi="Consolas"/>
+          <w:sz w:val="18"/>
+          <w:szCs w:val="18"/>
+        </w:rPr>
+        <w:t xml:space="preserve">    for raiz in self.temas_correspondentes(termo):</w:t>
+      </w:r>
+    </w:p>
+    <w:p>
+      <w:pPr>
+        <w:shd w:fill="F2F2F2" w:val="clear"/>
+        <w:spacing w:after="0"/>
+      </w:pPr>
+      <w:r>
+        <w:rPr>
+          <w:rFonts w:ascii="Consolas" w:cs="Consolas" w:eastAsia="Consolas" w:hAnsi="Consolas"/>
+          <w:sz w:val="18"/>
+          <w:szCs w:val="18"/>
+        </w:rPr>
+        <w:t xml:space="preserve">        query = f'''{PREFIXOS}</w:t>
+      </w:r>
+    </w:p>
+    <w:p>
+      <w:pPr>
+        <w:shd w:fill="F2F2F2" w:val="clear"/>
+        <w:spacing w:after="0"/>
+      </w:pPr>
+      <w:r>
+        <w:rPr>
+          <w:rFonts w:ascii="Consolas" w:cs="Consolas" w:eastAsia="Consolas" w:hAnsi="Consolas"/>
+          <w:sz w:val="18"/>
+          <w:szCs w:val="18"/>
+        </w:rPr>
+        <w:t xml:space="preserve">        SELECT DISTINCT ?nomeSub WHERE {</w:t>
+      </w:r>
+    </w:p>
+    <w:p>
+      <w:pPr>
+        <w:shd w:fill="F2F2F2" w:val="clear"/>
+        <w:spacing w:after="0"/>
+      </w:pPr>
+      <w:r>
+        <w:rPr>
+          <w:rFonts w:ascii="Consolas" w:cs="Consolas" w:eastAsia="Consolas" w:hAnsi="Consolas"/>
+          <w:sz w:val="18"/>
+          <w:szCs w:val="18"/>
+        </w:rPr>
+        <w:t xml:space="preserve">            ?temaRaiz basi:nome "{raiz}" .</w:t>
+      </w:r>
+    </w:p>
+    <w:p>
+      <w:pPr>
+        <w:shd w:fill="F2F2F2" w:val="clear"/>
+        <w:spacing w:after="0"/>
+      </w:pPr>
+      <w:r>
+        <w:rPr>
+          <w:rFonts w:ascii="Consolas" w:cs="Consolas" w:eastAsia="Consolas" w:hAnsi="Consolas"/>
+          <w:sz w:val="18"/>
+          <w:szCs w:val="18"/>
+        </w:rPr>
+        <w:t xml:space="preserve">            ?sub basi:eSubtemaDe* ?temaRaiz ;</w:t>
+      </w:r>
+    </w:p>
+    <w:p>
+      <w:pPr>
+        <w:shd w:fill="F2F2F2" w:val="clear"/>
+        <w:spacing w:after="0"/>
+      </w:pPr>
+      <w:r>
+        <w:rPr>
+          <w:rFonts w:ascii="Consolas" w:cs="Consolas" w:eastAsia="Consolas" w:hAnsi="Consolas"/>
+          <w:sz w:val="18"/>
+          <w:szCs w:val="18"/>
+        </w:rPr>
+        <w:t xml:space="preserve">                 basi:nome ?nomeSub .</w:t>
+      </w:r>
+    </w:p>
+    <w:p>
+      <w:pPr>
+        <w:shd w:fill="F2F2F2" w:val="clear"/>
+        <w:spacing w:after="0"/>
+      </w:pPr>
+      <w:r>
+        <w:rPr>
+          <w:rFonts w:ascii="Consolas" w:cs="Consolas" w:eastAsia="Consolas" w:hAnsi="Consolas"/>
+          <w:sz w:val="18"/>
+          <w:szCs w:val="18"/>
+        </w:rPr>
+        <w:t xml:space="preserve">        }'''</w:t>
+      </w:r>
+    </w:p>
+    <w:p>
+      <w:pPr>
+        <w:shd w:fill="F2F2F2" w:val="clear"/>
+        <w:spacing w:after="0"/>
+      </w:pPr>
+      <w:r>
+        <w:rPr>
+          <w:rFonts w:ascii="Consolas" w:cs="Consolas" w:eastAsia="Consolas" w:hAnsi="Consolas"/>
+          <w:sz w:val="18"/>
+          <w:szCs w:val="18"/>
+        </w:rPr>
+        <w:t xml:space="preserve">        for linha in self.executar_select(query):</w:t>
+      </w:r>
+    </w:p>
+    <w:p>
+      <w:pPr>
+        <w:shd w:fill="F2F2F2" w:val="clear"/>
+        <w:spacing w:after="0"/>
+      </w:pPr>
+      <w:r>
+        <w:rPr>
+          <w:rFonts w:ascii="Consolas" w:cs="Consolas" w:eastAsia="Consolas" w:hAnsi="Consolas"/>
+          <w:sz w:val="18"/>
+          <w:szCs w:val="18"/>
+        </w:rPr>
+        <w:t xml:space="preserve">            nomes.append(linha["nomeSub"])</w:t>
+      </w:r>
+    </w:p>
+    <w:p>
+      <w:pPr>
+        <w:shd w:fill="F2F2F2" w:val="clear"/>
+        <w:spacing w:after="120"/>
+      </w:pPr>
+      <w:r>
+        <w:rPr>
+          <w:rFonts w:ascii="Consolas" w:cs="Consolas" w:eastAsia="Consolas" w:hAnsi="Consolas"/>
+          <w:sz w:val="18"/>
+          <w:szCs w:val="18"/>
+        </w:rPr>
+        <w:t xml:space="preserve">    return nomes</w:t>
+      </w:r>
+    </w:p>
+    <w:p>
+      <w:pPr>
+        <w:pStyle w:val="Heading1"/>
+      </w:pPr>
+      <w:r>
+        <w:t xml:space="preserve">8. Arquitectura da Solução</w:t>
+      </w:r>
+    </w:p>
+    <w:p>
+      <w:pPr>
+        <w:spacing w:after="120" w:line="276"/>
+      </w:pPr>
+      <w:r>
         <w:t xml:space="preserve">A solução adopta uma arquitectura em camadas com persistência poliglota: cada tipo de dado é guardado no repositório mais adequado.</w:t>
       </w:r>
     </w:p>
@@ -1567,10 +2239,42 @@
     </w:p>
     <w:p>
       <w:pPr>
+        <w:pStyle w:val="Heading2"/>
+      </w:pPr>
+      <w:r>
+        <w:t xml:space="preserve">8.1 Modelação da base de dados relacional</w:t>
+      </w:r>
+    </w:p>
+    <w:p>
+      <w:pPr>
+        <w:spacing w:after="120" w:line="276"/>
+      </w:pPr>
+      <w:r>
+        <w:t xml:space="preserve">O esquema PostgreSQL (database/schema.sql) inclui as tabelas utilizadores, areas_cientificas, temas (com auto-referência tema_pai_id), palavras_chave, universidades, departamentos, cursos e documentos, além das tabelas de associação documento_temas, coautores, favoritos e seguidores, e ainda tokens_refresh. Possui um índice GIN de texto completo em português, campos de auditoria (created_at/updated_at) e o campo uri_semantica que estabelece a ligação com o grafo RDF.</w:t>
+      </w:r>
+    </w:p>
+    <w:p>
+      <w:pPr>
+        <w:pStyle w:val="Heading2"/>
+      </w:pPr>
+      <w:r>
+        <w:t xml:space="preserve">8.2 Sincronização SQL ↔ RDF</w:t>
+      </w:r>
+    </w:p>
+    <w:p>
+      <w:pPr>
+        <w:spacing w:after="120" w:line="276"/>
+      </w:pPr>
+      <w:r>
+        <w:t xml:space="preserve">Quando o administrador adiciona ou remove um documento, o sistema actualiza simultaneamente a base relacional e o grafo RDF, garantindo que a pesquisa semântica reflecte sempre o estado actual do catálogo.</w:t>
+      </w:r>
+    </w:p>
+    <w:p>
+      <w:pPr>
         <w:pStyle w:val="Heading1"/>
       </w:pPr>
       <w:r>
-        <w:t xml:space="preserve">7. Modelação da Base de Dados Relacional</w:t>
+        <w:t xml:space="preserve">9. Tecnologias Utilizadas</w:t>
       </w:r>
     </w:p>
     <w:p>
@@ -1578,186 +2282,7 @@
         <w:spacing w:after="120" w:line="276"/>
       </w:pPr>
       <w:r>
-        <w:t xml:space="preserve">O esquema PostgreSQL (database/schema.sql) inclui as tabelas utilizadores, areas_cientificas, temas (com auto-referência tema_pai_id), palavras_chave, universidades, departamentos, cursos e documentos, além das tabelas de associação documento_temas, coautores, favoritos e seguidores, e ainda tokens_refresh.</w:t>
-      </w:r>
-    </w:p>
-    <w:p>
-      <w:pPr>
-        <w:pStyle w:val="ListParagraph"/>
-        <w:numPr>
-          <w:ilvl w:val="0"/>
-          <w:numId w:val="2"/>
-        </w:numPr>
-        <w:spacing w:after="60"/>
-      </w:pPr>
-      <w:r>
-        <w:t xml:space="preserve">Índice GIN de texto completo (full-text) em português para a pesquisa textual.</w:t>
-      </w:r>
-    </w:p>
-    <w:p>
-      <w:pPr>
-        <w:pStyle w:val="ListParagraph"/>
-        <w:numPr>
-          <w:ilvl w:val="0"/>
-          <w:numId w:val="2"/>
-        </w:numPr>
-        <w:spacing w:after="60"/>
-      </w:pPr>
-      <w:r>
-        <w:t xml:space="preserve">Campos created_at/updated_at para auditoria e chaves primárias do tipo BIGINT IDENTITY.</w:t>
-      </w:r>
-    </w:p>
-    <w:p>
-      <w:pPr>
-        <w:pStyle w:val="ListParagraph"/>
-        <w:numPr>
-          <w:ilvl w:val="0"/>
-          <w:numId w:val="2"/>
-        </w:numPr>
-        <w:spacing w:after="60"/>
-      </w:pPr>
-      <w:r>
-        <w:t xml:space="preserve">O campo uri_semantica em cada entidade estabelece a ligação com o grafo RDF.</w:t>
-      </w:r>
-    </w:p>
-    <w:p>
-      <w:pPr>
-        <w:pStyle w:val="Heading1"/>
-      </w:pPr>
-      <w:r>
-        <w:t xml:space="preserve">8. Modelação da Ontologia (OWL)</w:t>
-      </w:r>
-    </w:p>
-    <w:p>
-      <w:pPr>
-        <w:spacing w:after="120" w:line="276"/>
-      </w:pPr>
-      <w:r>
-        <w:t xml:space="preserve">A ontologia (ontology/basi.ttl) define a hierarquia de classes Pessoa → Autor → {Professor, Estudante, Investigador}, as subclasses de Documento (Livro, Artigo, Tese, Monografia, Manual, Apresentação, Material Didáctico) e as classes AreaCientifica, Tema, Genero e PalavraChave.</w:t>
-      </w:r>
-    </w:p>
-    <w:p>
-      <w:pPr>
-        <w:spacing w:after="120" w:line="276"/>
-      </w:pPr>
-      <w:r>
-        <w:t xml:space="preserve">Inclui propriedades de objecto (transitivas, simétricas e inversas), propriedades de dados e restrições OWL — por exemplo, classes inferidas por owl:equivalentClass e restrições de cardinalidade mínima de autores. A CDU é modelada como um skos:ConceptScheme, em que cada secção/género é um skos:Concept. As instâncias de exemplo estão em rdf/dados_exemplo.ttl.</w:t>
-      </w:r>
-    </w:p>
-    <w:p>
-      <w:pPr>
-        <w:pStyle w:val="Heading1"/>
-      </w:pPr>
-      <w:r>
-        <w:t xml:space="preserve">9. Consultas SPARQL e Inferência</w:t>
-      </w:r>
-    </w:p>
-    <w:p>
-      <w:pPr>
-        <w:spacing w:after="120" w:line="276"/>
-      </w:pPr>
-      <w:r>
-        <w:t xml:space="preserve">O ficheiro sparql/consultas.sparql reúne 22 consultas comentadas. A consulta-chave da pesquisa semântica usa um caminho de propriedade transitivo:</w:t>
-      </w:r>
-    </w:p>
-    <w:p>
-      <w:pPr>
-        <w:shd w:fill="F2F2F2" w:val="clear"/>
-        <w:spacing w:after="0"/>
-      </w:pPr>
-      <w:r>
-        <w:rPr>
-          <w:rFonts w:ascii="Consolas" w:cs="Consolas" w:eastAsia="Consolas" w:hAnsi="Consolas"/>
-          <w:sz w:val="18"/>
-          <w:szCs w:val="18"/>
-        </w:rPr>
-        <w:t xml:space="preserve">SELECT DISTINCT ?titulo WHERE {</w:t>
-      </w:r>
-    </w:p>
-    <w:p>
-      <w:pPr>
-        <w:shd w:fill="F2F2F2" w:val="clear"/>
-        <w:spacing w:after="0"/>
-      </w:pPr>
-      <w:r>
-        <w:rPr>
-          <w:rFonts w:ascii="Consolas" w:cs="Consolas" w:eastAsia="Consolas" w:hAnsi="Consolas"/>
-          <w:sz w:val="18"/>
-          <w:szCs w:val="18"/>
-        </w:rPr>
-        <w:t xml:space="preserve">  ?temaRaiz basi:nome "Inteligência Artificial" .</w:t>
-      </w:r>
-    </w:p>
-    <w:p>
-      <w:pPr>
-        <w:shd w:fill="F2F2F2" w:val="clear"/>
-        <w:spacing w:after="0"/>
-      </w:pPr>
-      <w:r>
-        <w:rPr>
-          <w:rFonts w:ascii="Consolas" w:cs="Consolas" w:eastAsia="Consolas" w:hAnsi="Consolas"/>
-          <w:sz w:val="18"/>
-          <w:szCs w:val="18"/>
-        </w:rPr>
-        <w:t xml:space="preserve">  ?tema basi:eSubtemaDe* ?temaRaiz .</w:t>
-      </w:r>
-    </w:p>
-    <w:p>
-      <w:pPr>
-        <w:shd w:fill="F2F2F2" w:val="clear"/>
-        <w:spacing w:after="0"/>
-      </w:pPr>
-      <w:r>
-        <w:rPr>
-          <w:rFonts w:ascii="Consolas" w:cs="Consolas" w:eastAsia="Consolas" w:hAnsi="Consolas"/>
-          <w:sz w:val="18"/>
-          <w:szCs w:val="18"/>
-        </w:rPr>
-        <w:t xml:space="preserve">  ?doc  basi:temTema ?tema ;</w:t>
-      </w:r>
-    </w:p>
-    <w:p>
-      <w:pPr>
-        <w:shd w:fill="F2F2F2" w:val="clear"/>
-        <w:spacing w:after="0"/>
-      </w:pPr>
-      <w:r>
-        <w:rPr>
-          <w:rFonts w:ascii="Consolas" w:cs="Consolas" w:eastAsia="Consolas" w:hAnsi="Consolas"/>
-          <w:sz w:val="18"/>
-          <w:szCs w:val="18"/>
-        </w:rPr>
-        <w:t xml:space="preserve">        basi:titulo  ?titulo .</w:t>
-      </w:r>
-    </w:p>
-    <w:p>
-      <w:pPr>
-        <w:shd w:fill="F2F2F2" w:val="clear"/>
-        <w:spacing w:after="120"/>
-      </w:pPr>
-      <w:r>
-        <w:rPr>
-          <w:rFonts w:ascii="Consolas" w:cs="Consolas" w:eastAsia="Consolas" w:hAnsi="Consolas"/>
-          <w:sz w:val="18"/>
-          <w:szCs w:val="18"/>
-        </w:rPr>
-        <w:t xml:space="preserve">}</w:t>
-      </w:r>
-    </w:p>
-    <w:p>
-      <w:pPr>
-        <w:spacing w:after="120" w:line="276"/>
-      </w:pPr>
-      <w:r>
-        <w:t xml:space="preserve">O operador * faz o motor percorrer toda a sub-árvore de temas, devolvendo documentos relacionados mesmo quando o título não contém a palavra pesquisada. A mesma lógica suporta as recomendações, que partem dos favoritos do utilizador e expandem pelos subtemas.</w:t>
-      </w:r>
-    </w:p>
-    <w:p>
-      <w:pPr>
-        <w:pStyle w:val="Heading1"/>
-      </w:pPr>
-      <w:r>
-        <w:t xml:space="preserve">10. Tecnologias Utilizadas</w:t>
+        <w:t xml:space="preserve">As tecnologias foram escolhidas pela maturidade, pela produtividade e pela boa integração com o ecossistema de Web Semântica:</w:t>
       </w:r>
     </w:p>
     <w:tbl>
@@ -2190,7 +2715,7 @@
         <w:pStyle w:val="Heading1"/>
       </w:pPr>
       <w:r>
-        <w:t xml:space="preserve">11. Implementação</w:t>
+        <w:t xml:space="preserve">10. Implementação</w:t>
       </w:r>
     </w:p>
     <w:p>
@@ -2198,7 +2723,7 @@
         <w:pStyle w:val="Heading2"/>
       </w:pPr>
       <w:r>
-        <w:t xml:space="preserve">11.1 Backend</w:t>
+        <w:t xml:space="preserve">10.1 Backend</w:t>
       </w:r>
     </w:p>
     <w:p>
@@ -2214,7 +2739,7 @@
         <w:pStyle w:val="Heading2"/>
       </w:pPr>
       <w:r>
-        <w:t xml:space="preserve">11.2 Frontend</w:t>
+        <w:t xml:space="preserve">10.2 Frontend</w:t>
       </w:r>
     </w:p>
     <w:p>
@@ -2230,7 +2755,80 @@
         <w:pStyle w:val="Heading2"/>
       </w:pPr>
       <w:r>
-        <w:t xml:space="preserve">11.3 Sincronização SQL ↔ RDF</w:t>
+        <w:t xml:space="preserve">10.3 Segurança</w:t>
+      </w:r>
+    </w:p>
+    <w:p>
+      <w:pPr>
+        <w:pStyle w:val="ListParagraph"/>
+        <w:numPr>
+          <w:ilvl w:val="0"/>
+          <w:numId w:val="2"/>
+        </w:numPr>
+        <w:spacing w:after="60"/>
+      </w:pPr>
+      <w:r>
+        <w:t xml:space="preserve">Palavras-passe guardadas apenas como hash bcrypt (com sal).</w:t>
+      </w:r>
+    </w:p>
+    <w:p>
+      <w:pPr>
+        <w:pStyle w:val="ListParagraph"/>
+        <w:numPr>
+          <w:ilvl w:val="0"/>
+          <w:numId w:val="2"/>
+        </w:numPr>
+        <w:spacing w:after="60"/>
+      </w:pPr>
+      <w:r>
+        <w:t xml:space="preserve">Autenticação JWT sem estado: token de acesso (30 min) e token de renovação (7 dias).</w:t>
+      </w:r>
+    </w:p>
+    <w:p>
+      <w:pPr>
+        <w:pStyle w:val="ListParagraph"/>
+        <w:numPr>
+          <w:ilvl w:val="0"/>
+          <w:numId w:val="2"/>
+        </w:numPr>
+        <w:spacing w:after="60"/>
+      </w:pPr>
+      <w:r>
+        <w:t xml:space="preserve">Autorização baseada em papéis (RBAC) através da dependência exigir_perfis(...).</w:t>
+      </w:r>
+    </w:p>
+    <w:p>
+      <w:pPr>
+        <w:pStyle w:val="ListParagraph"/>
+        <w:numPr>
+          <w:ilvl w:val="0"/>
+          <w:numId w:val="2"/>
+        </w:numPr>
+        <w:spacing w:after="60"/>
+      </w:pPr>
+      <w:r>
+        <w:t xml:space="preserve">Endpoint SPARQL restrito a leitura (bloqueia INSERT, DELETE, DROP, etc.).</w:t>
+      </w:r>
+    </w:p>
+    <w:p>
+      <w:pPr>
+        <w:pStyle w:val="ListParagraph"/>
+        <w:numPr>
+          <w:ilvl w:val="0"/>
+          <w:numId w:val="2"/>
+        </w:numPr>
+        <w:spacing w:after="60"/>
+      </w:pPr>
+      <w:r>
+        <w:t xml:space="preserve">CORS limitado às origens autorizadas.</w:t>
+      </w:r>
+    </w:p>
+    <w:p>
+      <w:pPr>
+        <w:pStyle w:val="Heading1"/>
+      </w:pPr>
+      <w:r>
+        <w:t xml:space="preserve">11. Resultados</w:t>
       </w:r>
     </w:p>
     <w:p>
@@ -2238,7 +2836,212 @@
         <w:spacing w:after="120" w:line="276"/>
       </w:pPr>
       <w:r>
-        <w:t xml:space="preserve">Quando o administrador adiciona ou remove um documento, o sistema actualiza simultaneamente a base relacional e o grafo RDF, garantindo que a pesquisa semântica reflecte sempre o estado actual do catálogo.</w:t>
+        <w:t xml:space="preserve">O sistema cumpre os objectivos propostos e a integração semântica funciona de ponta a ponta. A figura seguinte mostra a pesquisa por “Inteligência Artificial”: o sistema expande o termo, por inferência transitiva, para nove temas relacionados (Machine Learning, Deep Learning, Redes Neurais, Aprendizagem por Reforço, Ciência de Dados, Big Data, Visão Computacional e Processamento de Linguagem Natural) e devolve os nove documentos ligados a qualquer um deles, indicando em cada resultado o tema que o tornou relevante.</w:t>
+      </w:r>
+    </w:p>
+    <w:p>
+      <w:pPr>
+        <w:spacing w:after="40" w:before="120"/>
+        <w:jc w:val="center"/>
+      </w:pPr>
+      <w:r>
+        <w:drawing>
+          <wp:inline distT="0" distB="0" distL="0" distR="0">
+            <wp:extent cx="3143250" cy="5715000"/>
+            <wp:effectExtent t="0" r="0" b="0" l="0"/>
+            <wp:docPr id="1" name="pesquisa_resultados.png" descr="Figura 2 — Pesquisa semântica: termos expandidos por inferência e documentos encontrados." title="Figura 2 — Pesquisa semântica: termos expandidos por inferência e documentos encontrados."/>
+            <wp:cNvGraphicFramePr>
+              <a:graphicFrameLocks xmlns:a="http://schemas.openxmlformats.org/drawingml/2006/main" noChangeAspect="1"/>
+            </wp:cNvGraphicFramePr>
+            <a:graphic xmlns:a="http://schemas.openxmlformats.org/drawingml/2006/main">
+              <a:graphicData uri="http://schemas.openxmlformats.org/drawingml/2006/picture">
+                <pic:pic xmlns:pic="http://schemas.openxmlformats.org/drawingml/2006/picture">
+                  <pic:nvPicPr>
+                    <pic:cNvPr id="0" name="" descr=""/>
+                    <pic:cNvPicPr>
+                      <a:picLocks noChangeAspect="1" noChangeArrowheads="1"/>
+                    </pic:cNvPicPr>
+                  </pic:nvPicPr>
+                  <pic:blipFill>
+                    <a:blip r:embed="rId10" cstate="none"/>
+                    <a:srcRect/>
+                    <a:stretch>
+                      <a:fillRect/>
+                    </a:stretch>
+                  </pic:blipFill>
+                  <pic:spPr bwMode="auto">
+                    <a:xfrm>
+                      <a:off x="0" y="0"/>
+                      <a:ext cx="3143250" cy="5715000"/>
+                    </a:xfrm>
+                    <a:prstGeom prst="rect">
+                      <a:avLst/>
+                    </a:prstGeom>
+                  </pic:spPr>
+                </pic:pic>
+              </a:graphicData>
+            </a:graphic>
+          </wp:inline>
+        </w:drawing>
+      </w:r>
+    </w:p>
+    <w:p>
+      <w:pPr>
+        <w:spacing w:after="200"/>
+        <w:jc w:val="center"/>
+      </w:pPr>
+      <w:r>
+        <w:rPr>
+          <w:i/>
+          <w:iCs/>
+          <w:color w:val="595959"/>
+          <w:sz w:val="18"/>
+          <w:szCs w:val="18"/>
+        </w:rPr>
+        <w:t xml:space="preserve">Figura 2 — Pesquisa semântica: termos expandidos por inferência e documentos encontrados.</w:t>
+      </w:r>
+    </w:p>
+    <w:p>
+      <w:pPr>
+        <w:spacing w:after="120" w:line="276"/>
+      </w:pPr>
+      <w:r>
+        <w:t xml:space="preserve">A biblioteca apresenta o acervo organizado pelas secções da Classificação Decimal Universal (CDU), com contagem de obras por secção e subdivisão da Literatura por género.</w:t>
+      </w:r>
+    </w:p>
+    <w:p>
+      <w:pPr>
+        <w:spacing w:after="40" w:before="120"/>
+        <w:jc w:val="center"/>
+      </w:pPr>
+      <w:r>
+        <w:drawing>
+          <wp:inline distT="0" distB="0" distL="0" distR="0">
+            <wp:extent cx="4476750" cy="3867150"/>
+            <wp:effectExtent t="0" r="0" b="0" l="0"/>
+            <wp:docPr id="1" name="biblioteca.png" descr="Figura 3 — Biblioteca organizada pelas secções da CDU." title="Figura 3 — Biblioteca organizada pelas secções da CDU."/>
+            <wp:cNvGraphicFramePr>
+              <a:graphicFrameLocks xmlns:a="http://schemas.openxmlformats.org/drawingml/2006/main" noChangeAspect="1"/>
+            </wp:cNvGraphicFramePr>
+            <a:graphic xmlns:a="http://schemas.openxmlformats.org/drawingml/2006/main">
+              <a:graphicData uri="http://schemas.openxmlformats.org/drawingml/2006/picture">
+                <pic:pic xmlns:pic="http://schemas.openxmlformats.org/drawingml/2006/picture">
+                  <pic:nvPicPr>
+                    <pic:cNvPr id="0" name="" descr=""/>
+                    <pic:cNvPicPr>
+                      <a:picLocks noChangeAspect="1" noChangeArrowheads="1"/>
+                    </pic:cNvPicPr>
+                  </pic:nvPicPr>
+                  <pic:blipFill>
+                    <a:blip r:embed="rId11" cstate="none"/>
+                    <a:srcRect/>
+                    <a:stretch>
+                      <a:fillRect/>
+                    </a:stretch>
+                  </pic:blipFill>
+                  <pic:spPr bwMode="auto">
+                    <a:xfrm>
+                      <a:off x="0" y="0"/>
+                      <a:ext cx="4476750" cy="3867150"/>
+                    </a:xfrm>
+                    <a:prstGeom prst="rect">
+                      <a:avLst/>
+                    </a:prstGeom>
+                  </pic:spPr>
+                </pic:pic>
+              </a:graphicData>
+            </a:graphic>
+          </wp:inline>
+        </w:drawing>
+      </w:r>
+    </w:p>
+    <w:p>
+      <w:pPr>
+        <w:spacing w:after="200"/>
+        <w:jc w:val="center"/>
+      </w:pPr>
+      <w:r>
+        <w:rPr>
+          <w:i/>
+          <w:iCs/>
+          <w:color w:val="595959"/>
+          <w:sz w:val="18"/>
+          <w:szCs w:val="18"/>
+        </w:rPr>
+        <w:t xml:space="preserve">Figura 3 — Biblioteca organizada pelas secções da CDU.</w:t>
+      </w:r>
+    </w:p>
+    <w:p>
+      <w:pPr>
+        <w:spacing w:after="120" w:line="276"/>
+      </w:pPr>
+      <w:r>
+        <w:t xml:space="preserve">Síntese dos resultados:</w:t>
+      </w:r>
+    </w:p>
+    <w:p>
+      <w:pPr>
+        <w:pStyle w:val="ListParagraph"/>
+        <w:numPr>
+          <w:ilvl w:val="0"/>
+          <w:numId w:val="2"/>
+        </w:numPr>
+        <w:spacing w:after="60"/>
+      </w:pPr>
+      <w:r>
+        <w:t xml:space="preserve">A pesquisa por um tema expande automaticamente para todos os seus subtemas e devolve os documentos ligados a qualquer um deles, mesmo sem a palavra pesquisada no título.</w:t>
+      </w:r>
+    </w:p>
+    <w:p>
+      <w:pPr>
+        <w:pStyle w:val="ListParagraph"/>
+        <w:numPr>
+          <w:ilvl w:val="0"/>
+          <w:numId w:val="2"/>
+        </w:numPr>
+        <w:spacing w:after="60"/>
+      </w:pPr>
+      <w:r>
+        <w:t xml:space="preserve">Termos que não correspondem a nenhum tema não são “inventados”: o sistema recorre à pesquisa por título/resumo e sugere temas válidos, evitando respostas sem sentido.</w:t>
+      </w:r>
+    </w:p>
+    <w:p>
+      <w:pPr>
+        <w:pStyle w:val="ListParagraph"/>
+        <w:numPr>
+          <w:ilvl w:val="0"/>
+          <w:numId w:val="2"/>
+        </w:numPr>
+        <w:spacing w:after="60"/>
+      </w:pPr>
+      <w:r>
+        <w:t xml:space="preserve">As recomendações partem dos favoritos do utilizador e, através da expansão transitiva, sugerem documentos de temas relacionados.</w:t>
+      </w:r>
+    </w:p>
+    <w:p>
+      <w:pPr>
+        <w:pStyle w:val="ListParagraph"/>
+        <w:numPr>
+          <w:ilvl w:val="0"/>
+          <w:numId w:val="2"/>
+        </w:numPr>
+        <w:spacing w:after="60"/>
+      </w:pPr>
+      <w:r>
+        <w:t xml:space="preserve">O controlo de acesso por perfis funciona em toda a aplicação, do backend à interface.</w:t>
+      </w:r>
+    </w:p>
+    <w:p>
+      <w:pPr>
+        <w:pStyle w:val="ListParagraph"/>
+        <w:numPr>
+          <w:ilvl w:val="0"/>
+          <w:numId w:val="2"/>
+        </w:numPr>
+        <w:spacing w:after="60"/>
+      </w:pPr>
+      <w:r>
+        <w:t xml:space="preserve">A adição/remoção de documentos pelo administrador reflecte-se imediatamente no grafo e na pesquisa.</w:t>
       </w:r>
     </w:p>
     <w:p>
@@ -2246,7 +3049,7 @@
         <w:pStyle w:val="Heading1"/>
       </w:pPr>
       <w:r>
-        <w:t xml:space="preserve">12. Segurança</w:t>
+        <w:t xml:space="preserve">12. Dificuldades</w:t>
       </w:r>
     </w:p>
     <w:p>
@@ -2259,7 +3062,7 @@
         <w:spacing w:after="60"/>
       </w:pPr>
       <w:r>
-        <w:t xml:space="preserve">Palavras-passe guardadas apenas como hash bcrypt (com sal).</w:t>
+        <w:t xml:space="preserve">Manter a coerência entre o mundo relacional e o semântico exigiu uma convenção rigorosa de IRIs (uri_semantica) partilhada pelas duas camadas.</w:t>
       </w:r>
     </w:p>
     <w:p>
@@ -2272,7 +3075,7 @@
         <w:spacing w:after="60"/>
       </w:pPr>
       <w:r>
-        <w:t xml:space="preserve">Autenticação JWT sem estado: token de acesso (30 min) e token de renovação (7 dias).</w:t>
+        <w:t xml:space="preserve">A primeira versão das recomendações não devolvia resultados, porque procurava apenas o tema exacto; a solução passou por usar a expansão transitiva eSubtemaDe*, que considera também os subtemas.</w:t>
       </w:r>
     </w:p>
     <w:p>
@@ -2285,7 +3088,7 @@
         <w:spacing w:after="60"/>
       </w:pPr>
       <w:r>
-        <w:t xml:space="preserve">Autorização baseada em papéis (RBAC) através da dependência exigir_perfis(...).</w:t>
+        <w:t xml:space="preserve">Foi necessário garantir o funcionamento sem o Fuseki externo, o que motivou a implementação do grafo rdflib em memória como alternativa.</w:t>
       </w:r>
     </w:p>
     <w:p>
@@ -2298,20 +3101,7 @@
         <w:spacing w:after="60"/>
       </w:pPr>
       <w:r>
-        <w:t xml:space="preserve">Endpoint SPARQL restrito a leitura (bloqueia INSERT, DELETE, DROP, etc.).</w:t>
-      </w:r>
-    </w:p>
-    <w:p>
-      <w:pPr>
-        <w:pStyle w:val="ListParagraph"/>
-        <w:numPr>
-          <w:ilvl w:val="0"/>
-          <w:numId w:val="2"/>
-        </w:numPr>
-        <w:spacing w:after="60"/>
-      </w:pPr>
-      <w:r>
-        <w:t xml:space="preserve">CORS limitado às origens autorizadas.</w:t>
+        <w:t xml:space="preserve">A modelação da CDU em SKOS, ligando cada secção à área científica já existente, exigiu cuidado para não duplicar conceitos.</w:t>
       </w:r>
     </w:p>
     <w:p>
@@ -2319,7 +3109,7 @@
         <w:pStyle w:val="Heading1"/>
       </w:pPr>
       <w:r>
-        <w:t xml:space="preserve">13. Resultados</w:t>
+        <w:t xml:space="preserve">13. Optimização, Escalabilidade e Testes</w:t>
       </w:r>
     </w:p>
     <w:p>
@@ -2327,72 +3117,7 @@
         <w:spacing w:after="120" w:line="276"/>
       </w:pPr>
       <w:r>
-        <w:t xml:space="preserve">O sistema cumpre os objectivos propostos. Os resultados mais relevantes são:</w:t>
-      </w:r>
-    </w:p>
-    <w:p>
-      <w:pPr>
-        <w:pStyle w:val="ListParagraph"/>
-        <w:numPr>
-          <w:ilvl w:val="0"/>
-          <w:numId w:val="2"/>
-        </w:numPr>
-        <w:spacing w:after="60"/>
-      </w:pPr>
-      <w:r>
-        <w:t xml:space="preserve">A pesquisa por “Inteligência Artificial” expande automaticamente para seis temas (Inteligência Artificial, Machine Learning, Deep Learning, Redes Neurais, Ciência de Dados e Visão Computacional) e devolve os documentos ligados a qualquer um deles, mesmo sem a palavra pesquisada no título.</w:t>
-      </w:r>
-    </w:p>
-    <w:p>
-      <w:pPr>
-        <w:pStyle w:val="ListParagraph"/>
-        <w:numPr>
-          <w:ilvl w:val="0"/>
-          <w:numId w:val="2"/>
-        </w:numPr>
-        <w:spacing w:after="60"/>
-      </w:pPr>
-      <w:r>
-        <w:t xml:space="preserve">As recomendações partem dos favoritos do utilizador e, através da expansão transitiva, sugerem documentos de temas relacionados.</w:t>
-      </w:r>
-    </w:p>
-    <w:p>
-      <w:pPr>
-        <w:pStyle w:val="ListParagraph"/>
-        <w:numPr>
-          <w:ilvl w:val="0"/>
-          <w:numId w:val="2"/>
-        </w:numPr>
-        <w:spacing w:after="60"/>
-      </w:pPr>
-      <w:r>
-        <w:t xml:space="preserve">A biblioteca apresenta o acervo organizado pelas secções da CDU, com filtro por género na Literatura.</w:t>
-      </w:r>
-    </w:p>
-    <w:p>
-      <w:pPr>
-        <w:pStyle w:val="ListParagraph"/>
-        <w:numPr>
-          <w:ilvl w:val="0"/>
-          <w:numId w:val="2"/>
-        </w:numPr>
-        <w:spacing w:after="60"/>
-      </w:pPr>
-      <w:r>
-        <w:t xml:space="preserve">O controlo de acesso por perfis funciona em toda a aplicação, do backend à interface.</w:t>
-      </w:r>
-    </w:p>
-    <w:p>
-      <w:pPr>
-        <w:pStyle w:val="ListParagraph"/>
-        <w:numPr>
-          <w:ilvl w:val="0"/>
-          <w:numId w:val="2"/>
-        </w:numPr>
-        <w:spacing w:after="60"/>
-      </w:pPr>
-      <w:r>
-        <w:t xml:space="preserve">A adição/remoção de documentos pelo administrador reflecte-se imediatamente no grafo e na pesquisa.</w:t>
+        <w:t xml:space="preserve">O backend é sem estado, o que permite escalar horizontalmente. Recorre-se a cache (lru_cache no carregamento do grafo e na configuração), paginação, índices relacionais e de texto completo, e à optimização dos caminhos transitivos. Existem testes automáticos com pytest sobre uma base SQLite isolada, cobrindo verificação de saúde, registo, início de sessão, leitura do utilizador autenticado, rejeição de email duplicado e publicação de documento, sem dependerem de PostgreSQL nem do Fuseki. A ontologia é validada por um script dedicado que confirma a sua boa formação. Como evolução, recomenda-se cache Redis para respostas SPARQL frequentes e réplicas de leitura no PostgreSQL.</w:t>
       </w:r>
     </w:p>
     <w:p>
@@ -2400,59 +3125,23 @@
         <w:pStyle w:val="Heading1"/>
       </w:pPr>
       <w:r>
-        <w:t xml:space="preserve">14. Dificuldades</w:t>
-      </w:r>
-    </w:p>
-    <w:p>
-      <w:pPr>
-        <w:pStyle w:val="ListParagraph"/>
-        <w:numPr>
-          <w:ilvl w:val="0"/>
-          <w:numId w:val="2"/>
-        </w:numPr>
-        <w:spacing w:after="60"/>
-      </w:pPr>
-      <w:r>
-        <w:t xml:space="preserve">Manter a coerência entre o mundo relacional e o semântico exigiu uma convenção rigorosa de IRIs (uri_semantica) partilhada pelas duas camadas.</w:t>
-      </w:r>
-    </w:p>
-    <w:p>
-      <w:pPr>
-        <w:pStyle w:val="ListParagraph"/>
-        <w:numPr>
-          <w:ilvl w:val="0"/>
-          <w:numId w:val="2"/>
-        </w:numPr>
-        <w:spacing w:after="60"/>
-      </w:pPr>
-      <w:r>
-        <w:t xml:space="preserve">A primeira versão das recomendações não devolvia resultados, porque procurava apenas o tema exacto; a solução passou por usar a expansão transitiva eSubtemaDe*, que considera também os subtemas.</w:t>
-      </w:r>
-    </w:p>
-    <w:p>
-      <w:pPr>
-        <w:pStyle w:val="ListParagraph"/>
-        <w:numPr>
-          <w:ilvl w:val="0"/>
-          <w:numId w:val="2"/>
-        </w:numPr>
-        <w:spacing w:after="60"/>
-      </w:pPr>
-      <w:r>
-        <w:t xml:space="preserve">Foi necessário garantir o funcionamento sem o Fuseki externo, o que motivou a implementação do grafo rdflib em memória como alternativa.</w:t>
-      </w:r>
-    </w:p>
-    <w:p>
-      <w:pPr>
-        <w:pStyle w:val="ListParagraph"/>
-        <w:numPr>
-          <w:ilvl w:val="0"/>
-          <w:numId w:val="2"/>
-        </w:numPr>
-        <w:spacing w:after="60"/>
-      </w:pPr>
-      <w:r>
-        <w:t xml:space="preserve">A modelação da CDU em SKOS, ligando cada secção à área científica já existente, exigiu cuidado para não duplicar conceitos.</w:t>
+        <w:t xml:space="preserve">14. Conclusões</w:t>
+      </w:r>
+    </w:p>
+    <w:p>
+      <w:pPr>
+        <w:spacing w:after="120" w:line="276"/>
+      </w:pPr>
+      <w:r>
+        <w:t xml:space="preserve">O BASI demonstra que a Web Semântica acrescenta valor real a uma biblioteca académica: a pesquisa deixa de ser por palavras e passa a ser por significado. A arquitectura poliglota separa identidade, conhecimento e ficheiros, mantendo o sistema testável e escalável, e a ontologia centraliza as relações entre temas, de modo que melhorar o grafo melhora de imediato a pesquisa e as recomendações, sem alterar o código. O projecto responde directamente à problemática do Tema 1 e cumpre todos os entregáveis exigidos: código-fonte, ontologia, base de conhecimento e este relatório técnico.</w:t>
+      </w:r>
+    </w:p>
+    <w:p>
+      <w:pPr>
+        <w:spacing w:after="120" w:line="276"/>
+      </w:pPr>
+      <w:r>
+        <w:t xml:space="preserve">Como trabalho futuro, prevê-se a introdução de cache Redis para a inferência, a importação automática de metadados (DOI/BibTeX), recomendações com embeddings e a materialização das inferências mais frequentes no Fuseki, reduzindo a latência.</w:t>
       </w:r>
     </w:p>
     <w:p>
@@ -2460,63 +3149,7 @@
         <w:pStyle w:val="Heading1"/>
       </w:pPr>
       <w:r>
-        <w:t xml:space="preserve">15. Optimização e Escalabilidade</w:t>
-      </w:r>
-    </w:p>
-    <w:p>
-      <w:pPr>
-        <w:spacing w:after="120" w:line="276"/>
-      </w:pPr>
-      <w:r>
-        <w:t xml:space="preserve">O backend é sem estado, o que permite escalar horizontalmente. Recorre-se a cache (lru_cache na configuração), paginação, índices relacionais e de texto completo, e à optimização dos caminhos transitivos. Como evolução, recomenda-se cache Redis para respostas SPARQL frequentes e réplicas de leitura no PostgreSQL.</w:t>
-      </w:r>
-    </w:p>
-    <w:p>
-      <w:pPr>
-        <w:pStyle w:val="Heading1"/>
-      </w:pPr>
-      <w:r>
-        <w:t xml:space="preserve">16. Testes</w:t>
-      </w:r>
-    </w:p>
-    <w:p>
-      <w:pPr>
-        <w:spacing w:after="120" w:line="276"/>
-      </w:pPr>
-      <w:r>
-        <w:t xml:space="preserve">Existem testes automáticos com pytest sobre uma base SQLite isolada, cobrindo verificação de saúde, registo, início de sessão, leitura do utilizador autenticado, rejeição de email duplicado e publicação de documento, sem dependerem de PostgreSQL nem do Fuseki. A ontologia é validada por um script dedicado que confirma a sua boa formação.</w:t>
-      </w:r>
-    </w:p>
-    <w:p>
-      <w:pPr>
-        <w:pStyle w:val="Heading1"/>
-      </w:pPr>
-      <w:r>
-        <w:t xml:space="preserve">17. Conclusões e Trabalho Futuro</w:t>
-      </w:r>
-    </w:p>
-    <w:p>
-      <w:pPr>
-        <w:spacing w:after="120" w:line="276"/>
-      </w:pPr>
-      <w:r>
-        <w:t xml:space="preserve">O BASI demonstra que a Web Semântica acrescenta valor real a uma biblioteca académica: a pesquisa deixa de ser por palavras e passa a ser por significado. A arquitectura poliglota separa identidade, conhecimento e ficheiros, mantendo o sistema testável e escalável, e a ontologia centraliza as relações entre temas, de modo que melhorar o grafo melhora de imediato a pesquisa e as recomendações, sem alterar o código.</w:t>
-      </w:r>
-    </w:p>
-    <w:p>
-      <w:pPr>
-        <w:spacing w:after="120" w:line="276"/>
-      </w:pPr>
-      <w:r>
-        <w:t xml:space="preserve">Como trabalho futuro, prevê-se a introdução de cache Redis para a inferência, a importação automática de metadados (DOI/BibTeX), recomendações com embeddings e a materialização das inferências mais frequentes no Fuseki, reduzindo a latência.</w:t>
-      </w:r>
-    </w:p>
-    <w:p>
-      <w:pPr>
-        <w:pStyle w:val="Heading1"/>
-      </w:pPr>
-      <w:r>
-        <w:t xml:space="preserve">18. Referências Bibliográficas</w:t>
+        <w:t xml:space="preserve">15. Referências Bibliográficas</w:t>
       </w:r>
     </w:p>
     <w:p>

</xml_diff>

<commit_message>
Pesquisa textual recorre à camada semântica; citações no relatório
A página de pesquisa por texto passa a recorrer automaticamente à pesquisa
por significado quando não há correspondência no título/resumo, evitando o
"Sem resultados" para termos como "Inteligência Artificial". O relatório
passa a ter citações no texto ligadas às referências bibliográficas.

Co-Authored-By: Claude Opus 4.7 <noreply@anthropic.com>
</commit_message>
<xml_diff>
--- a/docs/Relatorio_BASI.docx
+++ b/docs/Relatorio_BASI.docx
@@ -1240,7 +1240,7 @@
         <w:spacing w:after="120" w:line="276"/>
       </w:pPr>
       <w:r>
-        <w:t xml:space="preserve">A Web Semântica estende a Web actual com significado processável por máquinas, assente num conjunto de normas do W3C:</w:t>
+        <w:t xml:space="preserve">A Web Semântica estende a Web actual com significado processável por máquinas, assente num conjunto de normas do W3C e nas boas práticas de modelação de ontologias [5]:</w:t>
       </w:r>
     </w:p>
     <w:p>
@@ -1260,7 +1260,7 @@
         <w:t xml:space="preserve">RDF </w:t>
       </w:r>
       <w:r>
-        <w:t xml:space="preserve">(Resource Description Framework): modelo de dados em triplos sujeito–predicado–objecto.</w:t>
+        <w:t xml:space="preserve">(Resource Description Framework): modelo de dados em triplos sujeito–predicado–objecto [1].</w:t>
       </w:r>
     </w:p>
     <w:p>
@@ -1280,7 +1280,7 @@
         <w:t xml:space="preserve">RDFS / OWL: </w:t>
       </w:r>
       <w:r>
-        <w:t xml:space="preserve">linguagens para descrever classes, propriedades e restrições, permitindo inferência.</w:t>
+        <w:t xml:space="preserve">linguagens para descrever classes, propriedades e restrições, permitindo inferência [2].</w:t>
       </w:r>
     </w:p>
     <w:p>
@@ -1300,7 +1300,7 @@
         <w:t xml:space="preserve">SPARQL: </w:t>
       </w:r>
       <w:r>
-        <w:t xml:space="preserve">linguagem de consulta sobre grafos RDF; suporta caminhos de propriedade (por exemplo, eSubtemaDe* significa zero ou mais saltos).</w:t>
+        <w:t xml:space="preserve">linguagem de consulta sobre grafos RDF; suporta caminhos de propriedade (por exemplo, eSubtemaDe* significa zero ou mais saltos) [3].</w:t>
       </w:r>
     </w:p>
     <w:p>
@@ -1320,7 +1320,7 @@
         <w:t xml:space="preserve">SKOS: </w:t>
       </w:r>
       <w:r>
-        <w:t xml:space="preserve">vocabulário-padrão para representar sistemas de classificação e taxonomias, usado aqui para modelar a CDU.</w:t>
+        <w:t xml:space="preserve">vocabulário-padrão para representar sistemas de classificação e taxonomias, usado aqui para modelar a CDU [4].</w:t>
       </w:r>
     </w:p>
     <w:p>
@@ -1348,7 +1348,7 @@
         <w:spacing w:after="120" w:line="276"/>
       </w:pPr>
       <w:r>
-        <w:t xml:space="preserve">Propriedades OWL utilizadas no projecto:</w:t>
+        <w:t xml:space="preserve">Propriedades OWL utilizadas no projecto [5]:</w:t>
       </w:r>
     </w:p>
     <w:p>

</xml_diff>

<commit_message>
Pesquisa por texto com ligação directa; nova captura no relatório
Adiciona deep-link (?q=) à página de pesquisa por texto e inclui no
relatório a captura do recurso à camada semântica (Figura 3), com a
captura da pesquisa por temas actualizada para nove temas.

Co-Authored-By: Claude Opus 4.7 <noreply@anthropic.com>
</commit_message>
<xml_diff>
--- a/docs/Relatorio_BASI.docx
+++ b/docs/Relatorio_BASI.docx
@@ -2906,7 +2906,7 @@
         <w:spacing w:after="120" w:line="276"/>
       </w:pPr>
       <w:r>
-        <w:t xml:space="preserve">A biblioteca apresenta o acervo organizado pelas secções da Classificação Decimal Universal (CDU), com contagem de obras por secção e subdivisão da Literatura por género.</w:t>
+        <w:t xml:space="preserve">A pesquisa por título também tira partido da camada semântica: quando um termo não corresponde a nenhum título nem resumo, o sistema recorre automaticamente à pesquisa por significado e mostra as obras dos temas relacionados, indicando o porquê de cada resultado.</w:t>
       </w:r>
     </w:p>
     <w:p>
@@ -2917,9 +2917,9 @@
       <w:r>
         <w:drawing>
           <wp:inline distT="0" distB="0" distL="0" distR="0">
-            <wp:extent cx="4476750" cy="3867150"/>
+            <wp:extent cx="4095750" cy="4467225"/>
             <wp:effectExtent t="0" r="0" b="0" l="0"/>
-            <wp:docPr id="1" name="biblioteca.png" descr="Figura 3 — Biblioteca organizada pelas secções da CDU." title="Figura 3 — Biblioteca organizada pelas secções da CDU."/>
+            <wp:docPr id="1" name="pesquisa_recurso_semantico.png" descr="Figura 3 — Recurso à camada semântica: sem correspondência textual, mostram-se obras por significado." title="Figura 3 — Recurso à camada semântica: sem correspondência textual, mostram-se obras por significado."/>
             <wp:cNvGraphicFramePr>
               <a:graphicFrameLocks xmlns:a="http://schemas.openxmlformats.org/drawingml/2006/main" noChangeAspect="1"/>
             </wp:cNvGraphicFramePr>
@@ -2942,6 +2942,76 @@
                   <pic:spPr bwMode="auto">
                     <a:xfrm>
                       <a:off x="0" y="0"/>
+                      <a:ext cx="4095750" cy="4467225"/>
+                    </a:xfrm>
+                    <a:prstGeom prst="rect">
+                      <a:avLst/>
+                    </a:prstGeom>
+                  </pic:spPr>
+                </pic:pic>
+              </a:graphicData>
+            </a:graphic>
+          </wp:inline>
+        </w:drawing>
+      </w:r>
+    </w:p>
+    <w:p>
+      <w:pPr>
+        <w:spacing w:after="200"/>
+        <w:jc w:val="center"/>
+      </w:pPr>
+      <w:r>
+        <w:rPr>
+          <w:i/>
+          <w:iCs/>
+          <w:color w:val="595959"/>
+          <w:sz w:val="18"/>
+          <w:szCs w:val="18"/>
+        </w:rPr>
+        <w:t xml:space="preserve">Figura 3 — Recurso à camada semântica: sem correspondência textual, mostram-se obras por significado.</w:t>
+      </w:r>
+    </w:p>
+    <w:p>
+      <w:pPr>
+        <w:spacing w:after="120" w:line="276"/>
+      </w:pPr>
+      <w:r>
+        <w:t xml:space="preserve">A biblioteca apresenta o acervo organizado pelas secções da Classificação Decimal Universal (CDU), com contagem de obras por secção e subdivisão da Literatura por género.</w:t>
+      </w:r>
+    </w:p>
+    <w:p>
+      <w:pPr>
+        <w:spacing w:after="40" w:before="120"/>
+        <w:jc w:val="center"/>
+      </w:pPr>
+      <w:r>
+        <w:drawing>
+          <wp:inline distT="0" distB="0" distL="0" distR="0">
+            <wp:extent cx="4476750" cy="3867150"/>
+            <wp:effectExtent t="0" r="0" b="0" l="0"/>
+            <wp:docPr id="1" name="biblioteca.png" descr="Figura 4 — Biblioteca organizada pelas secções da CDU." title="Figura 4 — Biblioteca organizada pelas secções da CDU."/>
+            <wp:cNvGraphicFramePr>
+              <a:graphicFrameLocks xmlns:a="http://schemas.openxmlformats.org/drawingml/2006/main" noChangeAspect="1"/>
+            </wp:cNvGraphicFramePr>
+            <a:graphic xmlns:a="http://schemas.openxmlformats.org/drawingml/2006/main">
+              <a:graphicData uri="http://schemas.openxmlformats.org/drawingml/2006/picture">
+                <pic:pic xmlns:pic="http://schemas.openxmlformats.org/drawingml/2006/picture">
+                  <pic:nvPicPr>
+                    <pic:cNvPr id="0" name="" descr=""/>
+                    <pic:cNvPicPr>
+                      <a:picLocks noChangeAspect="1" noChangeArrowheads="1"/>
+                    </pic:cNvPicPr>
+                  </pic:nvPicPr>
+                  <pic:blipFill>
+                    <a:blip r:embed="rId12" cstate="none"/>
+                    <a:srcRect/>
+                    <a:stretch>
+                      <a:fillRect/>
+                    </a:stretch>
+                  </pic:blipFill>
+                  <pic:spPr bwMode="auto">
+                    <a:xfrm>
+                      <a:off x="0" y="0"/>
                       <a:ext cx="4476750" cy="3867150"/>
                     </a:xfrm>
                     <a:prstGeom prst="rect">
@@ -2968,7 +3038,7 @@
           <w:sz w:val="18"/>
           <w:szCs w:val="18"/>
         </w:rPr>
-        <w:t xml:space="preserve">Figura 3 — Biblioteca organizada pelas secções da CDU.</w:t>
+        <w:t xml:space="preserve">Figura 4 — Biblioteca organizada pelas secções da CDU.</w:t>
       </w:r>
     </w:p>
     <w:p>

</xml_diff>

<commit_message>
docs(relatorio): capturas do ambiente em produção e funcionalidades novas
- Substitui figuras 1, 2 e 4 por capturas do site em produção (55 obras).
- Acrescenta secção 11.1 (implantação online + filtros, histórico,
  notificações, estatísticas e circulação) e requisitos RF9–RF13.
- Clarifica a relação entre o núcleo RDF (12 docs) e o catálogo (55 obras)
  e regista os 493 triplos carregados no Fuseki.

Co-Authored-By: Claude Opus 4.7 <noreply@anthropic.com>
</commit_message>
<xml_diff>
--- a/docs/Relatorio_BASI.docx
+++ b/docs/Relatorio_BASI.docx
@@ -1031,9 +1031,9 @@
       <w:r>
         <w:drawing>
           <wp:inline distT="0" distB="0" distL="0" distR="0">
-            <wp:extent cx="3619500" cy="4933950"/>
+            <wp:extent cx="3810000" cy="4181475"/>
             <wp:effectExtent t="0" r="0" b="0" l="0"/>
-            <wp:docPr id="1" name="home.png" descr="Figura 1 — Página inicial do BASI, com demonstração da pesquisa semântica." title="Figura 1 — Página inicial do BASI, com demonstração da pesquisa semântica."/>
+            <wp:docPr id="1" name="home.png" descr="Figura 1 — Página inicial do BASI (versão em produção), com demonstração da pesquisa semântica." title="Figura 1 — Página inicial do BASI (versão em produção), com demonstração da pesquisa semântica."/>
             <wp:cNvGraphicFramePr>
               <a:graphicFrameLocks xmlns:a="http://schemas.openxmlformats.org/drawingml/2006/main" noChangeAspect="1"/>
             </wp:cNvGraphicFramePr>
@@ -1056,7 +1056,7 @@
                   <pic:spPr bwMode="auto">
                     <a:xfrm>
                       <a:off x="0" y="0"/>
-                      <a:ext cx="3619500" cy="4933950"/>
+                      <a:ext cx="3810000" cy="4181475"/>
                     </a:xfrm>
                     <a:prstGeom prst="rect">
                       <a:avLst/>
@@ -1082,7 +1082,7 @@
           <w:sz w:val="18"/>
           <w:szCs w:val="18"/>
         </w:rPr>
-        <w:t xml:space="preserve">Figura 1 — Página inicial do BASI, com demonstração da pesquisa semântica.</w:t>
+        <w:t xml:space="preserve">Figura 1 — Página inicial do BASI (versão em produção), com demonstração da pesquisa semântica.</w:t>
       </w:r>
     </w:p>
     <w:p>
@@ -1561,6 +1561,71 @@
     </w:p>
     <w:p>
       <w:pPr>
+        <w:pStyle w:val="ListParagraph"/>
+        <w:numPr>
+          <w:ilvl w:val="0"/>
+          <w:numId w:val="2"/>
+        </w:numPr>
+        <w:spacing w:after="60"/>
+      </w:pPr>
+      <w:r>
+        <w:t xml:space="preserve">RF9 — Filtrar a pesquisa por autor e por ano de publicação.</w:t>
+      </w:r>
+    </w:p>
+    <w:p>
+      <w:pPr>
+        <w:pStyle w:val="ListParagraph"/>
+        <w:numPr>
+          <w:ilvl w:val="0"/>
+          <w:numId w:val="2"/>
+        </w:numPr>
+        <w:spacing w:after="60"/>
+      </w:pPr>
+      <w:r>
+        <w:t xml:space="preserve">RF10 — Consultar o histórico pessoal de leituras e de pesquisas.</w:t>
+      </w:r>
+    </w:p>
+    <w:p>
+      <w:pPr>
+        <w:pStyle w:val="ListParagraph"/>
+        <w:numPr>
+          <w:ilvl w:val="0"/>
+          <w:numId w:val="2"/>
+        </w:numPr>
+        <w:spacing w:after="60"/>
+      </w:pPr>
+      <w:r>
+        <w:t xml:space="preserve">RF11 — Receber notificações de novos documentos adicionados ao acervo.</w:t>
+      </w:r>
+    </w:p>
+    <w:p>
+      <w:pPr>
+        <w:pStyle w:val="ListParagraph"/>
+        <w:numPr>
+          <w:ilvl w:val="0"/>
+          <w:numId w:val="2"/>
+        </w:numPr>
+        <w:spacing w:after="60"/>
+      </w:pPr>
+      <w:r>
+        <w:t xml:space="preserve">RF12 — Consultar estatísticas de utilização (perfil administrador).</w:t>
+      </w:r>
+    </w:p>
+    <w:p>
+      <w:pPr>
+        <w:pStyle w:val="ListParagraph"/>
+        <w:numPr>
+          <w:ilvl w:val="0"/>
+          <w:numId w:val="2"/>
+        </w:numPr>
+        <w:spacing w:after="60"/>
+      </w:pPr>
+      <w:r>
+        <w:t xml:space="preserve">RF13 — Gerir a circulação: exemplares, empréstimos, reservas e multas.</w:t>
+      </w:r>
+    </w:p>
+    <w:p>
+      <w:pPr>
         <w:pStyle w:val="Heading2"/>
       </w:pPr>
       <w:r>
@@ -1774,7 +1839,7 @@
         <w:spacing w:after="120" w:line="276"/>
       </w:pPr>
       <w:r>
-        <w:t xml:space="preserve">A base de conhecimento (rdf/dados_exemplo.ttl) materializa as instâncias (ABox): áreas científicas, uma hierarquia de temas com três níveis de profundidade, autores, doze documentos técnicos e as relações entre eles (autoria, tema, citações e obras relacionadas). O excerto abaixo ilustra como a hierarquia de temas e a classificação de um documento são declaradas em triplos RDF:</w:t>
+        <w:t xml:space="preserve">A base de conhecimento (rdf/dados_exemplo.ttl) materializa as instâncias (ABox): áreas científicas, uma hierarquia de temas com três níveis de profundidade, autores, doze documentos técnicos e as relações entre eles (autoria, tema, citações e obras relacionadas). Estes doze documentos formam o núcleo densamente ligado que sustenta a demonstração da inferência; o catálogo completo da aplicação reúne 55 obras (documentos técnicos e literatura de domínio público), todas classificadas pela CDU. No servidor Fuseki em produção estão carregados 493 triplos. O excerto abaixo ilustra como a hierarquia de temas e a classificação de um documento são declaradas em triplos RDF:</w:t>
       </w:r>
     </w:p>
     <w:p>
@@ -2847,9 +2912,9 @@
       <w:r>
         <w:drawing>
           <wp:inline distT="0" distB="0" distL="0" distR="0">
-            <wp:extent cx="3143250" cy="5715000"/>
+            <wp:extent cx="3429000" cy="4267200"/>
             <wp:effectExtent t="0" r="0" b="0" l="0"/>
-            <wp:docPr id="1" name="pesquisa_resultados.png" descr="Figura 2 — Pesquisa semântica: termos expandidos por inferência e documentos encontrados." title="Figura 2 — Pesquisa semântica: termos expandidos por inferência e documentos encontrados."/>
+            <wp:docPr id="1" name="pesquisa_resultados.png" descr="Figura 2 — Pesquisa semântica (em produção): nove temas expandidos por inferência e os nove documentos encontrados." title="Figura 2 — Pesquisa semântica (em produção): nove temas expandidos por inferência e os nove documentos encontrados."/>
             <wp:cNvGraphicFramePr>
               <a:graphicFrameLocks xmlns:a="http://schemas.openxmlformats.org/drawingml/2006/main" noChangeAspect="1"/>
             </wp:cNvGraphicFramePr>
@@ -2872,7 +2937,7 @@
                   <pic:spPr bwMode="auto">
                     <a:xfrm>
                       <a:off x="0" y="0"/>
-                      <a:ext cx="3143250" cy="5715000"/>
+                      <a:ext cx="3429000" cy="4267200"/>
                     </a:xfrm>
                     <a:prstGeom prst="rect">
                       <a:avLst/>
@@ -2898,7 +2963,7 @@
           <w:sz w:val="18"/>
           <w:szCs w:val="18"/>
         </w:rPr>
-        <w:t xml:space="preserve">Figura 2 — Pesquisa semântica: termos expandidos por inferência e documentos encontrados.</w:t>
+        <w:t xml:space="preserve">Figura 2 — Pesquisa semântica (em produção): nove temas expandidos por inferência e os nove documentos encontrados.</w:t>
       </w:r>
     </w:p>
     <w:p>
@@ -2987,9 +3052,9 @@
       <w:r>
         <w:drawing>
           <wp:inline distT="0" distB="0" distL="0" distR="0">
-            <wp:extent cx="4476750" cy="3867150"/>
+            <wp:extent cx="4667250" cy="3105150"/>
             <wp:effectExtent t="0" r="0" b="0" l="0"/>
-            <wp:docPr id="1" name="biblioteca.png" descr="Figura 4 — Biblioteca organizada pelas secções da CDU." title="Figura 4 — Biblioteca organizada pelas secções da CDU."/>
+            <wp:docPr id="1" name="biblioteca.png" descr="Figura 4 — Biblioteca (em produção) organizada pelas secções da CDU, com 55 obras no acervo." title="Figura 4 — Biblioteca (em produção) organizada pelas secções da CDU, com 55 obras no acervo."/>
             <wp:cNvGraphicFramePr>
               <a:graphicFrameLocks xmlns:a="http://schemas.openxmlformats.org/drawingml/2006/main" noChangeAspect="1"/>
             </wp:cNvGraphicFramePr>
@@ -3012,7 +3077,7 @@
                   <pic:spPr bwMode="auto">
                     <a:xfrm>
                       <a:off x="0" y="0"/>
-                      <a:ext cx="4476750" cy="3867150"/>
+                      <a:ext cx="4667250" cy="3105150"/>
                     </a:xfrm>
                     <a:prstGeom prst="rect">
                       <a:avLst/>
@@ -3038,7 +3103,7 @@
           <w:sz w:val="18"/>
           <w:szCs w:val="18"/>
         </w:rPr>
-        <w:t xml:space="preserve">Figura 4 — Biblioteca organizada pelas secções da CDU.</w:t>
+        <w:t xml:space="preserve">Figura 4 — Biblioteca (em produção) organizada pelas secções da CDU, com 55 obras no acervo.</w:t>
       </w:r>
     </w:p>
     <w:p>
@@ -3112,6 +3177,95 @@
       </w:pPr>
       <w:r>
         <w:t xml:space="preserve">A adição/remoção de documentos pelo administrador reflecte-se imediatamente no grafo e na pesquisa.</w:t>
+      </w:r>
+    </w:p>
+    <w:p>
+      <w:pPr>
+        <w:pStyle w:val="Heading2"/>
+      </w:pPr>
+      <w:r>
+        <w:t xml:space="preserve">11.1 Implantação em produção e funcionalidades complementares</w:t>
+      </w:r>
+    </w:p>
+    <w:p>
+      <w:pPr>
+        <w:spacing w:after="120" w:line="276"/>
+      </w:pPr>
+      <w:r>
+        <w:t xml:space="preserve">A aplicação encontra-se publicada e acessível em linha: o frontend em https://basi-frontend-3zod.onrender.com e a API em https://basi-backend-50sv.onrender.com/api/v1, com o endpoint SPARQL e o grafo Apache Jena Fuseki activos (493 triplos carregados). O acervo em produção conta com 55 obras, combinando documentos técnicos e literatura de domínio público classificada pela CDU. As figuras 1, 2 e 4 deste relatório foram captadas directamente do ambiente em produção.</w:t>
+      </w:r>
+    </w:p>
+    <w:p>
+      <w:pPr>
+        <w:spacing w:after="120" w:line="276"/>
+      </w:pPr>
+      <w:r>
+        <w:t xml:space="preserve">Em torno do núcleo semântico, o sistema integra ainda funcionalidades próprias de uma biblioteca real, que complementam — sem substituir — a exploração do conhecimento:</w:t>
+      </w:r>
+    </w:p>
+    <w:p>
+      <w:pPr>
+        <w:pStyle w:val="ListParagraph"/>
+        <w:numPr>
+          <w:ilvl w:val="0"/>
+          <w:numId w:val="2"/>
+        </w:numPr>
+        <w:spacing w:after="60"/>
+      </w:pPr>
+      <w:r>
+        <w:t xml:space="preserve">Filtros de pesquisa por autor e por ano, a par da pesquisa textual e da pesquisa semântica.</w:t>
+      </w:r>
+    </w:p>
+    <w:p>
+      <w:pPr>
+        <w:pStyle w:val="ListParagraph"/>
+        <w:numPr>
+          <w:ilvl w:val="0"/>
+          <w:numId w:val="2"/>
+        </w:numPr>
+        <w:spacing w:after="60"/>
+      </w:pPr>
+      <w:r>
+        <w:t xml:space="preserve">Histórico pessoal de leituras e de pesquisas, por utilizador.</w:t>
+      </w:r>
+    </w:p>
+    <w:p>
+      <w:pPr>
+        <w:pStyle w:val="ListParagraph"/>
+        <w:numPr>
+          <w:ilvl w:val="0"/>
+          <w:numId w:val="2"/>
+        </w:numPr>
+        <w:spacing w:after="60"/>
+      </w:pPr>
+      <w:r>
+        <w:t xml:space="preserve">Notificações de novos documentos adicionados ao acervo.</w:t>
+      </w:r>
+    </w:p>
+    <w:p>
+      <w:pPr>
+        <w:pStyle w:val="ListParagraph"/>
+        <w:numPr>
+          <w:ilvl w:val="0"/>
+          <w:numId w:val="2"/>
+        </w:numPr>
+        <w:spacing w:after="60"/>
+      </w:pPr>
+      <w:r>
+        <w:t xml:space="preserve">Painel de estatísticas (administrador): obras mais vistas e descarregadas, distribuição por secção da CDU e termos mais pesquisados.</w:t>
+      </w:r>
+    </w:p>
+    <w:p>
+      <w:pPr>
+        <w:pStyle w:val="ListParagraph"/>
+        <w:numPr>
+          <w:ilvl w:val="0"/>
+          <w:numId w:val="2"/>
+        </w:numPr>
+        <w:spacing w:after="60"/>
+      </w:pPr>
+      <w:r>
+        <w:t xml:space="preserve">Módulo de circulação: gestão de exemplares, empréstimos, reservas e multas.</w:t>
       </w:r>
     </w:p>
     <w:p>

</xml_diff>

<commit_message>
docs: espaçamento de 1,5 linhas no corpo do relatório
Aplica entrelinha de 1,5 (line=360) aos parágrafos e listas do corpo,
conforme normas de formatação académica. Regenera DOCX e PDF.

Co-Authored-By: Claude Opus 4.7 <noreply@anthropic.com>
</commit_message>
<xml_diff>
--- a/docs/Relatorio_BASI.docx
+++ b/docs/Relatorio_BASI.docx
@@ -63,7 +63,7 @@
     </w:p>
     <w:p>
       <w:pPr>
-        <w:spacing w:after="120" w:line="276"/>
+        <w:spacing w:after="120" w:line="360"/>
         <w:jc w:val="center"/>
       </w:pPr>
       <w:r>
@@ -72,7 +72,7 @@
     </w:p>
     <w:p>
       <w:pPr>
-        <w:spacing w:after="120" w:line="276"/>
+        <w:spacing w:after="120" w:line="360"/>
         <w:jc w:val="center"/>
       </w:pPr>
       <w:r>
@@ -81,7 +81,7 @@
     </w:p>
     <w:p>
       <w:pPr>
-        <w:spacing w:after="120" w:line="276"/>
+        <w:spacing w:after="120" w:line="360"/>
         <w:jc w:val="center"/>
       </w:pPr>
       <w:r>
@@ -90,7 +90,7 @@
     </w:p>
     <w:p>
       <w:pPr>
-        <w:spacing w:after="120" w:line="276"/>
+        <w:spacing w:after="120" w:line="360"/>
         <w:jc w:val="center"/>
       </w:pPr>
       <w:r>
@@ -134,7 +134,7 @@
     </w:p>
     <w:p>
       <w:pPr>
-        <w:spacing w:after="120" w:line="276"/>
+        <w:spacing w:after="120" w:line="360"/>
         <w:jc w:val="center"/>
       </w:pPr>
       <w:r>
@@ -156,7 +156,7 @@
     </w:p>
     <w:p>
       <w:pPr>
-        <w:spacing w:after="120" w:line="276"/>
+        <w:spacing w:after="120" w:line="360"/>
         <w:jc w:val="left"/>
       </w:pPr>
       <w:r>
@@ -165,7 +165,7 @@
     </w:p>
     <w:p>
       <w:pPr>
-        <w:spacing w:after="120" w:line="276"/>
+        <w:spacing w:after="120" w:line="360"/>
         <w:jc w:val="left"/>
       </w:pPr>
       <w:r>
@@ -174,7 +174,7 @@
     </w:p>
     <w:p>
       <w:pPr>
-        <w:spacing w:after="120" w:line="276"/>
+        <w:spacing w:after="120" w:line="360"/>
         <w:jc w:val="left"/>
       </w:pPr>
       <w:r>
@@ -247,7 +247,7 @@
     </w:p>
     <w:p>
       <w:pPr>
-        <w:spacing w:after="120" w:line="276"/>
+        <w:spacing w:after="120" w:line="360"/>
         <w:jc w:val="both"/>
       </w:pPr>
       <w:r>
@@ -1056,7 +1056,7 @@
     </w:p>
     <w:p>
       <w:pPr>
-        <w:spacing w:after="120" w:line="276"/>
+        <w:spacing w:after="120" w:line="360"/>
         <w:jc w:val="both"/>
       </w:pPr>
       <w:r>
@@ -1065,7 +1065,7 @@
     </w:p>
     <w:p>
       <w:pPr>
-        <w:spacing w:after="120" w:line="276"/>
+        <w:spacing w:after="120" w:line="360"/>
         <w:jc w:val="both"/>
       </w:pPr>
       <w:r>
@@ -1136,7 +1136,7 @@
     </w:p>
     <w:p>
       <w:pPr>
-        <w:spacing w:after="120" w:line="276"/>
+        <w:spacing w:after="120" w:line="360"/>
         <w:jc w:val="both"/>
       </w:pPr>
       <w:r>
@@ -1153,7 +1153,7 @@
     </w:p>
     <w:p>
       <w:pPr>
-        <w:spacing w:after="120" w:line="276"/>
+        <w:spacing w:after="120" w:line="360"/>
         <w:jc w:val="both"/>
       </w:pPr>
       <w:r>
@@ -1162,7 +1162,7 @@
     </w:p>
     <w:p>
       <w:pPr>
-        <w:spacing w:after="120" w:line="276"/>
+        <w:spacing w:after="120" w:line="360"/>
         <w:jc w:val="both"/>
       </w:pPr>
       <w:r>
@@ -1187,7 +1187,7 @@
     </w:p>
     <w:p>
       <w:pPr>
-        <w:spacing w:after="120" w:line="276"/>
+        <w:spacing w:after="120" w:line="360"/>
         <w:jc w:val="both"/>
       </w:pPr>
       <w:r>
@@ -1209,7 +1209,7 @@
           <w:ilvl w:val="0"/>
           <w:numId w:val="2"/>
         </w:numPr>
-        <w:spacing w:after="60"/>
+        <w:spacing w:after="60" w:line="360"/>
       </w:pPr>
       <w:r>
         <w:t xml:space="preserve">Modelar o domínio académico numa ontologia OWL (TBox) com instâncias RDF (ABox).</w:t>
@@ -1222,7 +1222,7 @@
           <w:ilvl w:val="0"/>
           <w:numId w:val="2"/>
         </w:numPr>
-        <w:spacing w:after="60"/>
+        <w:spacing w:after="60" w:line="360"/>
       </w:pPr>
       <w:r>
         <w:t xml:space="preserve">Implementar pesquisa semântica com inferência via SPARQL, recorrendo a caminhos transitivos.</w:t>
@@ -1235,7 +1235,7 @@
           <w:ilvl w:val="0"/>
           <w:numId w:val="2"/>
         </w:numPr>
-        <w:spacing w:after="60"/>
+        <w:spacing w:after="60" w:line="360"/>
       </w:pPr>
       <w:r>
         <w:t xml:space="preserve">Oferecer recomendações inteligentes baseadas no grafo de conhecimento.</w:t>
@@ -1248,7 +1248,7 @@
           <w:ilvl w:val="0"/>
           <w:numId w:val="2"/>
         </w:numPr>
-        <w:spacing w:after="60"/>
+        <w:spacing w:after="60" w:line="360"/>
       </w:pPr>
       <w:r>
         <w:t xml:space="preserve">Disponibilizar autenticação segura (JWT + RBAC) e gestão de documentos.</w:t>
@@ -1261,7 +1261,7 @@
           <w:ilvl w:val="0"/>
           <w:numId w:val="2"/>
         </w:numPr>
-        <w:spacing w:after="60"/>
+        <w:spacing w:after="60" w:line="360"/>
       </w:pPr>
       <w:r>
         <w:t xml:space="preserve">Organizar o acervo segundo a Classificação Decimal Universal (CDU), modelada em SKOS.</w:t>
@@ -1274,7 +1274,7 @@
           <w:ilvl w:val="0"/>
           <w:numId w:val="2"/>
         </w:numPr>
-        <w:spacing w:after="60"/>
+        <w:spacing w:after="60" w:line="360"/>
       </w:pPr>
       <w:r>
         <w:t xml:space="preserve">Orquestrar os componentes com persistência poliglota (relacional, grafo e ficheiros).</w:t>
@@ -1290,7 +1290,7 @@
     </w:p>
     <w:p>
       <w:pPr>
-        <w:spacing w:after="120" w:line="276"/>
+        <w:spacing w:after="120" w:line="360"/>
         <w:jc w:val="both"/>
       </w:pPr>
       <w:r>
@@ -1304,7 +1304,7 @@
           <w:ilvl w:val="0"/>
           <w:numId w:val="2"/>
         </w:numPr>
-        <w:spacing w:after="60"/>
+        <w:spacing w:after="60" w:line="360"/>
       </w:pPr>
       <w:r>
         <w:rPr>
@@ -1324,7 +1324,7 @@
           <w:ilvl w:val="0"/>
           <w:numId w:val="2"/>
         </w:numPr>
-        <w:spacing w:after="60"/>
+        <w:spacing w:after="60" w:line="360"/>
       </w:pPr>
       <w:r>
         <w:rPr>
@@ -1344,7 +1344,7 @@
           <w:ilvl w:val="0"/>
           <w:numId w:val="2"/>
         </w:numPr>
-        <w:spacing w:after="60"/>
+        <w:spacing w:after="60" w:line="360"/>
       </w:pPr>
       <w:r>
         <w:rPr>
@@ -1364,7 +1364,7 @@
           <w:ilvl w:val="0"/>
           <w:numId w:val="2"/>
         </w:numPr>
-        <w:spacing w:after="60"/>
+        <w:spacing w:after="60" w:line="360"/>
       </w:pPr>
       <w:r>
         <w:rPr>
@@ -1384,7 +1384,7 @@
           <w:ilvl w:val="0"/>
           <w:numId w:val="2"/>
         </w:numPr>
-        <w:spacing w:after="60"/>
+        <w:spacing w:after="60" w:line="360"/>
       </w:pPr>
       <w:r>
         <w:rPr>
@@ -1399,7 +1399,7 @@
     </w:p>
     <w:p>
       <w:pPr>
-        <w:spacing w:after="120" w:line="276"/>
+        <w:spacing w:after="120" w:line="360"/>
         <w:jc w:val="both"/>
       </w:pPr>
       <w:r>
@@ -1413,7 +1413,7 @@
           <w:ilvl w:val="0"/>
           <w:numId w:val="2"/>
         </w:numPr>
-        <w:spacing w:after="60"/>
+        <w:spacing w:after="60" w:line="360"/>
       </w:pPr>
       <w:r>
         <w:rPr>
@@ -1433,7 +1433,7 @@
           <w:ilvl w:val="0"/>
           <w:numId w:val="2"/>
         </w:numPr>
-        <w:spacing w:after="60"/>
+        <w:spacing w:after="60" w:line="360"/>
       </w:pPr>
       <w:r>
         <w:rPr>
@@ -1453,7 +1453,7 @@
           <w:ilvl w:val="0"/>
           <w:numId w:val="2"/>
         </w:numPr>
-        <w:spacing w:after="60"/>
+        <w:spacing w:after="60" w:line="360"/>
       </w:pPr>
       <w:r>
         <w:rPr>
@@ -1473,7 +1473,7 @@
           <w:ilvl w:val="0"/>
           <w:numId w:val="2"/>
         </w:numPr>
-        <w:spacing w:after="60"/>
+        <w:spacing w:after="60" w:line="360"/>
       </w:pPr>
       <w:r>
         <w:rPr>
@@ -1496,7 +1496,7 @@
     </w:p>
     <w:p>
       <w:pPr>
-        <w:spacing w:after="120" w:line="276"/>
+        <w:spacing w:after="120" w:line="360"/>
         <w:jc w:val="both"/>
       </w:pPr>
       <w:r>
@@ -1518,7 +1518,7 @@
           <w:ilvl w:val="0"/>
           <w:numId w:val="2"/>
         </w:numPr>
-        <w:spacing w:after="60"/>
+        <w:spacing w:after="60" w:line="360"/>
       </w:pPr>
       <w:r>
         <w:t xml:space="preserve">RF1 — Pesquisar conteúdos (pesquisa textual e pesquisa semântica).</w:t>
@@ -1531,7 +1531,7 @@
           <w:ilvl w:val="0"/>
           <w:numId w:val="2"/>
         </w:numPr>
-        <w:spacing w:after="60"/>
+        <w:spacing w:after="60" w:line="360"/>
       </w:pPr>
       <w:r>
         <w:t xml:space="preserve">RF2 — Consultar o detalhe de um documento e descarregá-lo conforme o nível de acesso.</w:t>
@@ -1544,7 +1544,7 @@
           <w:ilvl w:val="0"/>
           <w:numId w:val="2"/>
         </w:numPr>
-        <w:spacing w:after="60"/>
+        <w:spacing w:after="60" w:line="360"/>
       </w:pPr>
       <w:r>
         <w:t xml:space="preserve">RF3 — Registar conta e iniciar sessão.</w:t>
@@ -1557,7 +1557,7 @@
           <w:ilvl w:val="0"/>
           <w:numId w:val="2"/>
         </w:numPr>
-        <w:spacing w:after="60"/>
+        <w:spacing w:after="60" w:line="360"/>
       </w:pPr>
       <w:r>
         <w:t xml:space="preserve">RF4 — Guardar favoritos e seguir autores.</w:t>
@@ -1570,7 +1570,7 @@
           <w:ilvl w:val="0"/>
           <w:numId w:val="2"/>
         </w:numPr>
-        <w:spacing w:after="60"/>
+        <w:spacing w:after="60" w:line="360"/>
       </w:pPr>
       <w:r>
         <w:t xml:space="preserve">RF5 — Receber recomendações personalizadas.</w:t>
@@ -1583,7 +1583,7 @@
           <w:ilvl w:val="0"/>
           <w:numId w:val="2"/>
         </w:numPr>
-        <w:spacing w:after="60"/>
+        <w:spacing w:after="60" w:line="360"/>
       </w:pPr>
       <w:r>
         <w:t xml:space="preserve">RF6 — Publicar documentos (professor/investigador).</w:t>
@@ -1596,7 +1596,7 @@
           <w:ilvl w:val="0"/>
           <w:numId w:val="2"/>
         </w:numPr>
-        <w:spacing w:after="60"/>
+        <w:spacing w:after="60" w:line="360"/>
       </w:pPr>
       <w:r>
         <w:t xml:space="preserve">RF7 — Administração: gerir utilizadores, documentos e sincronização com o grafo.</w:t>
@@ -1609,7 +1609,7 @@
           <w:ilvl w:val="0"/>
           <w:numId w:val="2"/>
         </w:numPr>
-        <w:spacing w:after="60"/>
+        <w:spacing w:after="60" w:line="360"/>
       </w:pPr>
       <w:r>
         <w:t xml:space="preserve">RF8 — Endpoint SPARQL apenas de leitura.</w:t>
@@ -1622,7 +1622,7 @@
           <w:ilvl w:val="0"/>
           <w:numId w:val="2"/>
         </w:numPr>
-        <w:spacing w:after="60"/>
+        <w:spacing w:after="60" w:line="360"/>
       </w:pPr>
       <w:r>
         <w:t xml:space="preserve">RF9 — Filtrar a pesquisa por autor e por ano de publicação.</w:t>
@@ -1635,7 +1635,7 @@
           <w:ilvl w:val="0"/>
           <w:numId w:val="2"/>
         </w:numPr>
-        <w:spacing w:after="60"/>
+        <w:spacing w:after="60" w:line="360"/>
       </w:pPr>
       <w:r>
         <w:t xml:space="preserve">RF10 — Consultar o histórico pessoal de leituras e de pesquisas.</w:t>
@@ -1648,7 +1648,7 @@
           <w:ilvl w:val="0"/>
           <w:numId w:val="2"/>
         </w:numPr>
-        <w:spacing w:after="60"/>
+        <w:spacing w:after="60" w:line="360"/>
       </w:pPr>
       <w:r>
         <w:t xml:space="preserve">RF11 — Receber notificações de novos documentos adicionados ao acervo.</w:t>
@@ -1661,7 +1661,7 @@
           <w:ilvl w:val="0"/>
           <w:numId w:val="2"/>
         </w:numPr>
-        <w:spacing w:after="60"/>
+        <w:spacing w:after="60" w:line="360"/>
       </w:pPr>
       <w:r>
         <w:t xml:space="preserve">RF12 — Consultar estatísticas de utilização (perfil administrador).</w:t>
@@ -1674,7 +1674,7 @@
           <w:ilvl w:val="0"/>
           <w:numId w:val="2"/>
         </w:numPr>
-        <w:spacing w:after="60"/>
+        <w:spacing w:after="60" w:line="360"/>
       </w:pPr>
       <w:r>
         <w:t xml:space="preserve">RF13 — Gerir a circulação: exemplares, empréstimos, reservas e multas.</w:t>
@@ -1690,7 +1690,7 @@
     </w:p>
     <w:p>
       <w:pPr>
-        <w:spacing w:after="120" w:line="276"/>
+        <w:spacing w:after="120" w:line="360"/>
         <w:jc w:val="both"/>
       </w:pPr>
       <w:r>
@@ -1707,7 +1707,7 @@
     </w:p>
     <w:p>
       <w:pPr>
-        <w:spacing w:after="120" w:line="276"/>
+        <w:spacing w:after="120" w:line="360"/>
         <w:jc w:val="both"/>
       </w:pPr>
       <w:r>
@@ -1716,7 +1716,7 @@
     </w:p>
     <w:p>
       <w:pPr>
-        <w:spacing w:after="120" w:line="276"/>
+        <w:spacing w:after="120" w:line="360"/>
         <w:jc w:val="both"/>
       </w:pPr>
       <w:r>
@@ -1879,7 +1879,7 @@
     </w:p>
     <w:p>
       <w:pPr>
-        <w:spacing w:after="120" w:line="276"/>
+        <w:spacing w:after="120" w:line="360"/>
         <w:jc w:val="both"/>
       </w:pPr>
       <w:r>
@@ -1896,7 +1896,7 @@
     </w:p>
     <w:p>
       <w:pPr>
-        <w:spacing w:after="120" w:line="276"/>
+        <w:spacing w:after="120" w:line="360"/>
         <w:jc w:val="both"/>
       </w:pPr>
       <w:r>
@@ -2017,7 +2017,7 @@
     </w:p>
     <w:p>
       <w:pPr>
-        <w:spacing w:after="120" w:line="276"/>
+        <w:spacing w:after="120" w:line="360"/>
         <w:jc w:val="both"/>
       </w:pPr>
       <w:r>
@@ -2110,7 +2110,7 @@
     </w:p>
     <w:p>
       <w:pPr>
-        <w:spacing w:after="120" w:line="276"/>
+        <w:spacing w:after="120" w:line="360"/>
         <w:jc w:val="both"/>
       </w:pPr>
       <w:r>
@@ -2295,7 +2295,7 @@
     </w:p>
     <w:p>
       <w:pPr>
-        <w:spacing w:after="120" w:line="276"/>
+        <w:spacing w:after="120" w:line="360"/>
         <w:jc w:val="both"/>
       </w:pPr>
       <w:r>
@@ -2360,7 +2360,7 @@
     </w:p>
     <w:p>
       <w:pPr>
-        <w:spacing w:after="120" w:line="276"/>
+        <w:spacing w:after="120" w:line="360"/>
         <w:jc w:val="both"/>
       </w:pPr>
       <w:r>
@@ -2377,7 +2377,7 @@
     </w:p>
     <w:p>
       <w:pPr>
-        <w:spacing w:after="120" w:line="276"/>
+        <w:spacing w:after="120" w:line="360"/>
         <w:jc w:val="both"/>
       </w:pPr>
       <w:r>
@@ -2394,7 +2394,7 @@
     </w:p>
     <w:p>
       <w:pPr>
-        <w:spacing w:after="120" w:line="276"/>
+        <w:spacing w:after="120" w:line="360"/>
         <w:jc w:val="both"/>
       </w:pPr>
       <w:r>
@@ -2411,7 +2411,7 @@
     </w:p>
     <w:p>
       <w:pPr>
-        <w:spacing w:after="120" w:line="276"/>
+        <w:spacing w:after="120" w:line="360"/>
         <w:jc w:val="both"/>
       </w:pPr>
       <w:r>
@@ -2861,7 +2861,7 @@
     </w:p>
     <w:p>
       <w:pPr>
-        <w:spacing w:after="120" w:line="276"/>
+        <w:spacing w:after="120" w:line="360"/>
         <w:jc w:val="both"/>
       </w:pPr>
       <w:r>
@@ -2878,7 +2878,7 @@
     </w:p>
     <w:p>
       <w:pPr>
-        <w:spacing w:after="120" w:line="276"/>
+        <w:spacing w:after="120" w:line="360"/>
         <w:jc w:val="both"/>
       </w:pPr>
       <w:r>
@@ -2900,7 +2900,7 @@
           <w:ilvl w:val="0"/>
           <w:numId w:val="2"/>
         </w:numPr>
-        <w:spacing w:after="60"/>
+        <w:spacing w:after="60" w:line="360"/>
       </w:pPr>
       <w:r>
         <w:t xml:space="preserve">Palavras-passe guardadas apenas como hash bcrypt (com sal).</w:t>
@@ -2913,7 +2913,7 @@
           <w:ilvl w:val="0"/>
           <w:numId w:val="2"/>
         </w:numPr>
-        <w:spacing w:after="60"/>
+        <w:spacing w:after="60" w:line="360"/>
       </w:pPr>
       <w:r>
         <w:t xml:space="preserve">Autenticação JWT sem estado: token de acesso (30 min) e token de renovação (7 dias).</w:t>
@@ -2926,7 +2926,7 @@
           <w:ilvl w:val="0"/>
           <w:numId w:val="2"/>
         </w:numPr>
-        <w:spacing w:after="60"/>
+        <w:spacing w:after="60" w:line="360"/>
       </w:pPr>
       <w:r>
         <w:t xml:space="preserve">Autorização baseada em papéis (RBAC) através da dependência exigir_perfis(...).</w:t>
@@ -2939,7 +2939,7 @@
           <w:ilvl w:val="0"/>
           <w:numId w:val="2"/>
         </w:numPr>
-        <w:spacing w:after="60"/>
+        <w:spacing w:after="60" w:line="360"/>
       </w:pPr>
       <w:r>
         <w:t xml:space="preserve">Endpoint SPARQL restrito a leitura (bloqueia INSERT, DELETE, DROP, etc.).</w:t>
@@ -2952,7 +2952,7 @@
           <w:ilvl w:val="0"/>
           <w:numId w:val="2"/>
         </w:numPr>
-        <w:spacing w:after="60"/>
+        <w:spacing w:after="60" w:line="360"/>
       </w:pPr>
       <w:r>
         <w:t xml:space="preserve">CORS limitado às origens autorizadas.</w:t>
@@ -2968,7 +2968,7 @@
     </w:p>
     <w:p>
       <w:pPr>
-        <w:spacing w:after="120" w:line="276"/>
+        <w:spacing w:after="120" w:line="360"/>
         <w:jc w:val="both"/>
       </w:pPr>
       <w:r>
@@ -3039,7 +3039,7 @@
     </w:p>
     <w:p>
       <w:pPr>
-        <w:spacing w:after="120" w:line="276"/>
+        <w:spacing w:after="120" w:line="360"/>
         <w:jc w:val="both"/>
       </w:pPr>
       <w:r>
@@ -3110,7 +3110,7 @@
     </w:p>
     <w:p>
       <w:pPr>
-        <w:spacing w:after="120" w:line="276"/>
+        <w:spacing w:after="120" w:line="360"/>
         <w:jc w:val="both"/>
       </w:pPr>
       <w:r>
@@ -3181,7 +3181,7 @@
     </w:p>
     <w:p>
       <w:pPr>
-        <w:spacing w:after="120" w:line="276"/>
+        <w:spacing w:after="120" w:line="360"/>
         <w:jc w:val="both"/>
       </w:pPr>
       <w:r>
@@ -3195,7 +3195,7 @@
           <w:ilvl w:val="0"/>
           <w:numId w:val="2"/>
         </w:numPr>
-        <w:spacing w:after="60"/>
+        <w:spacing w:after="60" w:line="360"/>
       </w:pPr>
       <w:r>
         <w:t xml:space="preserve">A pesquisa por um tema expande automaticamente para todos os seus subtemas e devolve os documentos ligados a qualquer um deles, mesmo sem a palavra pesquisada no título.</w:t>
@@ -3208,7 +3208,7 @@
           <w:ilvl w:val="0"/>
           <w:numId w:val="2"/>
         </w:numPr>
-        <w:spacing w:after="60"/>
+        <w:spacing w:after="60" w:line="360"/>
       </w:pPr>
       <w:r>
         <w:t xml:space="preserve">Termos que não correspondem a nenhum tema não são “inventados”: o sistema recorre à pesquisa por título/resumo e sugere temas válidos, evitando respostas sem sentido.</w:t>
@@ -3221,7 +3221,7 @@
           <w:ilvl w:val="0"/>
           <w:numId w:val="2"/>
         </w:numPr>
-        <w:spacing w:after="60"/>
+        <w:spacing w:after="60" w:line="360"/>
       </w:pPr>
       <w:r>
         <w:t xml:space="preserve">As recomendações partem dos favoritos do utilizador e, através da expansão transitiva, sugerem documentos de temas relacionados.</w:t>
@@ -3234,7 +3234,7 @@
           <w:ilvl w:val="0"/>
           <w:numId w:val="2"/>
         </w:numPr>
-        <w:spacing w:after="60"/>
+        <w:spacing w:after="60" w:line="360"/>
       </w:pPr>
       <w:r>
         <w:t xml:space="preserve">O controlo de acesso por perfis funciona em toda a aplicação, do backend à interface.</w:t>
@@ -3247,7 +3247,7 @@
           <w:ilvl w:val="0"/>
           <w:numId w:val="2"/>
         </w:numPr>
-        <w:spacing w:after="60"/>
+        <w:spacing w:after="60" w:line="360"/>
       </w:pPr>
       <w:r>
         <w:t xml:space="preserve">A adição/remoção de documentos pelo administrador reflecte-se imediatamente no grafo e na pesquisa.</w:t>
@@ -3263,7 +3263,7 @@
     </w:p>
     <w:p>
       <w:pPr>
-        <w:spacing w:after="120" w:line="276"/>
+        <w:spacing w:after="120" w:line="360"/>
         <w:jc w:val="both"/>
       </w:pPr>
       <w:r>
@@ -3272,7 +3272,7 @@
     </w:p>
     <w:p>
       <w:pPr>
-        <w:spacing w:after="120" w:line="276"/>
+        <w:spacing w:after="120" w:line="360"/>
         <w:jc w:val="both"/>
       </w:pPr>
       <w:r>
@@ -3286,7 +3286,7 @@
           <w:ilvl w:val="0"/>
           <w:numId w:val="2"/>
         </w:numPr>
-        <w:spacing w:after="60"/>
+        <w:spacing w:after="60" w:line="360"/>
       </w:pPr>
       <w:r>
         <w:t xml:space="preserve">Filtros de pesquisa por autor e por ano, a par da pesquisa textual e da pesquisa semântica.</w:t>
@@ -3299,7 +3299,7 @@
           <w:ilvl w:val="0"/>
           <w:numId w:val="2"/>
         </w:numPr>
-        <w:spacing w:after="60"/>
+        <w:spacing w:after="60" w:line="360"/>
       </w:pPr>
       <w:r>
         <w:t xml:space="preserve">Histórico pessoal de leituras e de pesquisas, por utilizador.</w:t>
@@ -3312,7 +3312,7 @@
           <w:ilvl w:val="0"/>
           <w:numId w:val="2"/>
         </w:numPr>
-        <w:spacing w:after="60"/>
+        <w:spacing w:after="60" w:line="360"/>
       </w:pPr>
       <w:r>
         <w:t xml:space="preserve">Notificações de novos documentos adicionados ao acervo.</w:t>
@@ -3325,7 +3325,7 @@
           <w:ilvl w:val="0"/>
           <w:numId w:val="2"/>
         </w:numPr>
-        <w:spacing w:after="60"/>
+        <w:spacing w:after="60" w:line="360"/>
       </w:pPr>
       <w:r>
         <w:t xml:space="preserve">Painel de estatísticas (administrador): obras mais vistas e descarregadas, distribuição por secção da CDU e termos mais pesquisados.</w:t>
@@ -3338,7 +3338,7 @@
           <w:ilvl w:val="0"/>
           <w:numId w:val="2"/>
         </w:numPr>
-        <w:spacing w:after="60"/>
+        <w:spacing w:after="60" w:line="360"/>
       </w:pPr>
       <w:r>
         <w:t xml:space="preserve">Módulo de circulação: gestão de exemplares, empréstimos, reservas e multas.</w:t>
@@ -3359,7 +3359,7 @@
           <w:ilvl w:val="0"/>
           <w:numId w:val="2"/>
         </w:numPr>
-        <w:spacing w:after="60"/>
+        <w:spacing w:after="60" w:line="360"/>
       </w:pPr>
       <w:r>
         <w:t xml:space="preserve">Manter a coerência entre o mundo relacional e o semântico exigiu uma convenção rigorosa de IRIs (uri_semantica) partilhada pelas duas camadas.</w:t>
@@ -3372,7 +3372,7 @@
           <w:ilvl w:val="0"/>
           <w:numId w:val="2"/>
         </w:numPr>
-        <w:spacing w:after="60"/>
+        <w:spacing w:after="60" w:line="360"/>
       </w:pPr>
       <w:r>
         <w:t xml:space="preserve">A primeira versão das recomendações não devolvia resultados, porque procurava apenas o tema exacto; a solução passou por usar a expansão transitiva eSubtemaDe*, que considera também os subtemas.</w:t>
@@ -3385,7 +3385,7 @@
           <w:ilvl w:val="0"/>
           <w:numId w:val="2"/>
         </w:numPr>
-        <w:spacing w:after="60"/>
+        <w:spacing w:after="60" w:line="360"/>
       </w:pPr>
       <w:r>
         <w:t xml:space="preserve">Foi necessário garantir o funcionamento sem o Fuseki externo, o que motivou a implementação do grafo rdflib em memória como alternativa.</w:t>
@@ -3398,7 +3398,7 @@
           <w:ilvl w:val="0"/>
           <w:numId w:val="2"/>
         </w:numPr>
-        <w:spacing w:after="60"/>
+        <w:spacing w:after="60" w:line="360"/>
       </w:pPr>
       <w:r>
         <w:t xml:space="preserve">A modelação da CDU em SKOS, ligando cada secção à área científica já existente, exigiu cuidado para não duplicar conceitos.</w:t>
@@ -3414,7 +3414,7 @@
     </w:p>
     <w:p>
       <w:pPr>
-        <w:spacing w:after="120" w:line="276"/>
+        <w:spacing w:after="120" w:line="360"/>
         <w:jc w:val="both"/>
       </w:pPr>
       <w:r>
@@ -3431,7 +3431,7 @@
     </w:p>
     <w:p>
       <w:pPr>
-        <w:spacing w:after="120" w:line="276"/>
+        <w:spacing w:after="120" w:line="360"/>
         <w:jc w:val="both"/>
       </w:pPr>
       <w:r>
@@ -3440,7 +3440,7 @@
     </w:p>
     <w:p>
       <w:pPr>
-        <w:spacing w:after="120" w:line="276"/>
+        <w:spacing w:after="120" w:line="360"/>
         <w:jc w:val="both"/>
       </w:pPr>
       <w:r>
@@ -3462,7 +3462,7 @@
           <w:ilvl w:val="0"/>
           <w:numId w:val="3"/>
         </w:numPr>
-        <w:spacing w:after="60"/>
+        <w:spacing w:after="60" w:line="360"/>
       </w:pPr>
       <w:r>
         <w:t xml:space="preserve">W3C. RDF 1.1 Concepts and Abstract Syntax. World Wide Web Consortium, 2014.</w:t>
@@ -3475,7 +3475,7 @@
           <w:ilvl w:val="0"/>
           <w:numId w:val="3"/>
         </w:numPr>
-        <w:spacing w:after="60"/>
+        <w:spacing w:after="60" w:line="360"/>
       </w:pPr>
       <w:r>
         <w:t xml:space="preserve">W3C. OWL 2 Web Ontology Language — Primer. World Wide Web Consortium, 2012.</w:t>
@@ -3488,7 +3488,7 @@
           <w:ilvl w:val="0"/>
           <w:numId w:val="3"/>
         </w:numPr>
-        <w:spacing w:after="60"/>
+        <w:spacing w:after="60" w:line="360"/>
       </w:pPr>
       <w:r>
         <w:t xml:space="preserve">W3C. SPARQL 1.1 Query Language. World Wide Web Consortium, 2013.</w:t>
@@ -3501,7 +3501,7 @@
           <w:ilvl w:val="0"/>
           <w:numId w:val="3"/>
         </w:numPr>
-        <w:spacing w:after="60"/>
+        <w:spacing w:after="60" w:line="360"/>
       </w:pPr>
       <w:r>
         <w:t xml:space="preserve">W3C. SKOS Simple Knowledge Organization System Reference. World Wide Web Consortium, 2009.</w:t>
@@ -3514,7 +3514,7 @@
           <w:ilvl w:val="0"/>
           <w:numId w:val="3"/>
         </w:numPr>
-        <w:spacing w:after="60"/>
+        <w:spacing w:after="60" w:line="360"/>
       </w:pPr>
       <w:r>
         <w:t xml:space="preserve">ALLEMANG, D.; HENDLER, J. Semantic Web for the Working Ontologist. 2.ª ed. Morgan Kaufmann, 2011.</w:t>
@@ -3527,7 +3527,7 @@
           <w:ilvl w:val="0"/>
           <w:numId w:val="3"/>
         </w:numPr>
-        <w:spacing w:after="60"/>
+        <w:spacing w:after="60" w:line="360"/>
       </w:pPr>
       <w:r>
         <w:t xml:space="preserve">Apache Software Foundation. Apache Jena Fuseki — Documentation. Disponível em jena.apache.org.</w:t>
@@ -3540,7 +3540,7 @@
           <w:ilvl w:val="0"/>
           <w:numId w:val="3"/>
         </w:numPr>
-        <w:spacing w:after="60"/>
+        <w:spacing w:after="60" w:line="360"/>
       </w:pPr>
       <w:r>
         <w:t xml:space="preserve">FastAPI. FastAPI Documentation. Disponível em fastapi.tiangolo.com.</w:t>
@@ -3553,7 +3553,7 @@
           <w:ilvl w:val="0"/>
           <w:numId w:val="3"/>
         </w:numPr>
-        <w:spacing w:after="60"/>
+        <w:spacing w:after="60" w:line="360"/>
       </w:pPr>
       <w:r>
         <w:t xml:space="preserve">Vercel. Next.js Documentation. Disponível em nextjs.org.</w:t>
@@ -3566,7 +3566,7 @@
           <w:ilvl w:val="0"/>
           <w:numId w:val="3"/>
         </w:numPr>
-        <w:spacing w:after="60"/>
+        <w:spacing w:after="60" w:line="360"/>
       </w:pPr>
       <w:r>
         <w:t xml:space="preserve">UDC Consortium. Universal Decimal Classification (CDU) — Outline. Disponível em udcc.org.</w:t>

</xml_diff>

<commit_message>
docs: marcadores de lista em Times New Roman (consistência tipográfica)
Define a fonte dos níveis de numeração/marcas para Times New Roman, de
modo a manter a coerência tipográfica do documento. Regenera DOCX e PDF.

Co-Authored-By: Claude Opus 4.7 <noreply@anthropic.com>
</commit_message>
<xml_diff>
--- a/docs/Relatorio_BASI.docx
+++ b/docs/Relatorio_BASI.docx
@@ -3790,6 +3790,9 @@
       <w:pPr>
         <w:ind w:left="720" w:hanging="360"/>
       </w:pPr>
+      <w:rPr>
+        <w:rFonts w:ascii="Times New Roman" w:cs="Times New Roman" w:eastAsia="Times New Roman" w:hAnsi="Times New Roman"/>
+      </w:rPr>
     </w:lvl>
   </w:abstractNum>
   <w:abstractNum w:abstractNumId="3" w15:restartNumberingAfterBreak="0">
@@ -3802,6 +3805,9 @@
       <w:pPr>
         <w:ind w:left="720" w:hanging="360"/>
       </w:pPr>
+      <w:rPr>
+        <w:rFonts w:ascii="Times New Roman" w:cs="Times New Roman" w:eastAsia="Times New Roman" w:hAnsi="Times New Roman"/>
+      </w:rPr>
     </w:lvl>
   </w:abstractNum>
   <w:num w:numId="1">

</xml_diff>

<commit_message>
docs: capa numa só página com data e rodapé com nº de página visível
Reduz os espaçamentos da capa para "Lubango, junho de 2026" caber na
primeira página, eliminando a página em branco. Destaca o número de
página no rodapé (negrito, maior, com filete superior). Regenera DOCX/PDF.

Co-Authored-By: Claude Opus 4.7 <noreply@anthropic.com>
</commit_message>
<xml_diff>
--- a/docs/Relatorio_BASI.docx
+++ b/docs/Relatorio_BASI.docx
@@ -99,7 +99,7 @@
     </w:p>
     <w:p>
       <w:pPr>
-        <w:spacing w:before="1600"/>
+        <w:spacing w:before="500"/>
       </w:pPr>
     </w:p>
     <w:p>
@@ -119,7 +119,7 @@
     </w:p>
     <w:p>
       <w:pPr>
-        <w:spacing w:after="1200"/>
+        <w:spacing w:after="400"/>
         <w:jc w:val="center"/>
       </w:pPr>
       <w:r>
@@ -143,7 +143,7 @@
     </w:p>
     <w:p>
       <w:pPr>
-        <w:spacing w:before="800"/>
+        <w:spacing w:before="300"/>
         <w:jc w:val="left"/>
       </w:pPr>
       <w:r>
@@ -183,14 +183,15 @@
     </w:p>
     <w:p>
       <w:pPr>
-        <w:spacing w:before="1400"/>
+        <w:spacing w:before="500"/>
         <w:jc w:val="center"/>
       </w:pPr>
       <w:r>
-        <w:t xml:space="preserve">Lubango, </w:t>
-      </w:r>
-      <w:r>
-        <w:t xml:space="preserve">junho de 2026</w:t>
+        <w:rPr>
+          <w:b/>
+          <w:bCs/>
+        </w:rPr>
+        <w:t xml:space="preserve">Lubango, junho de 2026</w:t>
       </w:r>
     </w:p>
     <w:p>
@@ -3634,19 +3635,26 @@
 <w:ftr xmlns:wpc="http://schemas.microsoft.com/office/word/2010/wordprocessingCanvas" xmlns:mc="http://schemas.openxmlformats.org/markup-compatibility/2006" xmlns:o="urn:schemas-microsoft-com:office:office" xmlns:r="http://schemas.openxmlformats.org/officeDocument/2006/relationships" xmlns:m="http://schemas.openxmlformats.org/officeDocument/2006/math" xmlns:v="urn:schemas-microsoft-com:vml" xmlns:wp14="http://schemas.microsoft.com/office/word/2010/wordprocessingDrawing" xmlns:wp="http://schemas.openxmlformats.org/drawingml/2006/wordprocessingDrawing" xmlns:w10="urn:schemas-microsoft-com:office:word" xmlns:w="http://schemas.openxmlformats.org/wordprocessingml/2006/main" xmlns:w14="http://schemas.microsoft.com/office/word/2010/wordml" xmlns:w15="http://schemas.microsoft.com/office/word/2012/wordml" xmlns:wpg="http://schemas.microsoft.com/office/word/2010/wordprocessingGroup" xmlns:wpi="http://schemas.microsoft.com/office/word/2010/wordprocessingInk" xmlns:wne="http://schemas.microsoft.com/office/word/2006/wordml" xmlns:wps="http://schemas.microsoft.com/office/word/2010/wordprocessingShape">
   <w:p>
     <w:pPr>
+      <w:pBdr>
+        <w:top w:val="single" w:color="BFBFBF" w:sz="4" w:space="6"/>
+      </w:pBdr>
       <w:jc w:val="center"/>
     </w:pPr>
     <w:r>
       <w:rPr>
-        <w:sz w:val="18"/>
-        <w:szCs w:val="18"/>
+        <w:color w:val="404040"/>
+        <w:sz w:val="20"/>
+        <w:szCs w:val="20"/>
       </w:rPr>
-      <w:t xml:space="preserve">BASI — Semantic Academic Hub  |  Página </w:t>
+      <w:t xml:space="preserve">BASI — Semantic Academic Hub      Página </w:t>
     </w:r>
     <w:r>
       <w:rPr>
-        <w:sz w:val="18"/>
-        <w:szCs w:val="18"/>
+        <w:b/>
+        <w:bCs/>
+        <w:color w:val="1F3864"/>
+        <w:sz w:val="20"/>
+        <w:szCs w:val="20"/>
       </w:rPr>
       <w:fldChar w:fldCharType="begin"/>
       <w:instrText xml:space="preserve">PAGE</w:instrText>

</xml_diff>

<commit_message>
docs: rodapé com número de página simples e numeração contínua
Substitui o rodapé com texto por um número de página simples, centrado e
bem visível. A capa não tem número (titlePage); as restantes páginas são
numeradas de forma contínua. Regenera DOCX e PDF.

Co-Authored-By: Claude Opus 4.7 <noreply@anthropic.com>
</commit_message>
<xml_diff>
--- a/docs/Relatorio_BASI.docx
+++ b/docs/Relatorio_BASI.docx
@@ -26,7 +26,7 @@
                     </pic:cNvPicPr>
                   </pic:nvPicPr>
                   <pic:blipFill>
-                    <a:blip r:embed="rId9" cstate="none"/>
+                    <a:blip r:embed="rId10" cstate="none"/>
                     <a:srcRect/>
                     <a:stretch>
                       <a:fillRect/>
@@ -1040,9 +1040,11 @@
       <w:pPr>
         <w:sectPr>
           <w:footerReference w:type="default" r:id="rId7"/>
+          <w:footerReference w:type="first" r:id="rId8"/>
           <w:pgSz w:w="12240" w:h="15840" w:orient="portrait"/>
           <w:pgMar w:top="1440" w:right="1440" w:bottom="1440" w:left="1440" w:header="708" w:footer="708" w:gutter="0"/>
           <w:pgNumType/>
+          <w:titlePg/>
           <w:docGrid w:linePitch="360"/>
         </w:sectPr>
       </w:pPr>
@@ -1097,7 +1099,7 @@
                     </pic:cNvPicPr>
                   </pic:nvPicPr>
                   <pic:blipFill>
-                    <a:blip r:embed="rId10" cstate="none"/>
+                    <a:blip r:embed="rId11" cstate="none"/>
                     <a:srcRect/>
                     <a:stretch>
                       <a:fillRect/>
@@ -3000,7 +3002,7 @@
                     </pic:cNvPicPr>
                   </pic:nvPicPr>
                   <pic:blipFill>
-                    <a:blip r:embed="rId11" cstate="none"/>
+                    <a:blip r:embed="rId12" cstate="none"/>
                     <a:srcRect/>
                     <a:stretch>
                       <a:fillRect/>
@@ -3058,77 +3060,6 @@
             <wp:extent cx="4095750" cy="4467225"/>
             <wp:effectExtent t="0" r="0" b="0" l="0"/>
             <wp:docPr id="1" name="pesquisa_recurso_semantico.png" descr="Figura 3 — Recurso à camada semântica: sem correspondência textual, mostram-se obras por significado." title="Figura 3 — Recurso à camada semântica: sem correspondência textual, mostram-se obras por significado."/>
-            <wp:cNvGraphicFramePr>
-              <a:graphicFrameLocks xmlns:a="http://schemas.openxmlformats.org/drawingml/2006/main" noChangeAspect="1"/>
-            </wp:cNvGraphicFramePr>
-            <a:graphic xmlns:a="http://schemas.openxmlformats.org/drawingml/2006/main">
-              <a:graphicData uri="http://schemas.openxmlformats.org/drawingml/2006/picture">
-                <pic:pic xmlns:pic="http://schemas.openxmlformats.org/drawingml/2006/picture">
-                  <pic:nvPicPr>
-                    <pic:cNvPr id="0" name="" descr=""/>
-                    <pic:cNvPicPr>
-                      <a:picLocks noChangeAspect="1" noChangeArrowheads="1"/>
-                    </pic:cNvPicPr>
-                  </pic:nvPicPr>
-                  <pic:blipFill>
-                    <a:blip r:embed="rId12" cstate="none"/>
-                    <a:srcRect/>
-                    <a:stretch>
-                      <a:fillRect/>
-                    </a:stretch>
-                  </pic:blipFill>
-                  <pic:spPr bwMode="auto">
-                    <a:xfrm>
-                      <a:off x="0" y="0"/>
-                      <a:ext cx="4095750" cy="4467225"/>
-                    </a:xfrm>
-                    <a:prstGeom prst="rect">
-                      <a:avLst/>
-                    </a:prstGeom>
-                  </pic:spPr>
-                </pic:pic>
-              </a:graphicData>
-            </a:graphic>
-          </wp:inline>
-        </w:drawing>
-      </w:r>
-    </w:p>
-    <w:p>
-      <w:pPr>
-        <w:spacing w:after="200"/>
-        <w:jc w:val="center"/>
-      </w:pPr>
-      <w:r>
-        <w:rPr>
-          <w:i/>
-          <w:iCs/>
-          <w:color w:val="595959"/>
-          <w:sz w:val="18"/>
-          <w:szCs w:val="18"/>
-        </w:rPr>
-        <w:t xml:space="preserve">Figura 3 — Recurso à camada semântica: sem correspondência textual, mostram-se obras por significado.</w:t>
-      </w:r>
-    </w:p>
-    <w:p>
-      <w:pPr>
-        <w:spacing w:after="120" w:line="360"/>
-        <w:jc w:val="both"/>
-      </w:pPr>
-      <w:r>
-        <w:t xml:space="preserve">A biblioteca apresenta o acervo organizado pelas secções da Classificação Decimal Universal (CDU), com contagem de obras por secção e subdivisão da Literatura por género.</w:t>
-      </w:r>
-    </w:p>
-    <w:p>
-      <w:pPr>
-        <w:spacing w:after="40" w:before="120"/>
-        <w:jc w:val="center"/>
-      </w:pPr>
-      <w:r>
-        <w:drawing>
-          <wp:inline distT="0" distB="0" distL="0" distR="0">
-            <wp:extent cx="4667250" cy="3105150"/>
-            <wp:effectExtent t="0" r="0" b="0" l="0"/>
-            <wp:docPr id="1" name="biblioteca.png" descr="Figura 4 — Biblioteca (em produção) organizada pelas secções da CDU, com 55 obras no acervo." title="Figura 4 — Biblioteca (em produção) organizada pelas secções da CDU, com 55 obras no acervo."/>
             <wp:cNvGraphicFramePr>
               <a:graphicFrameLocks xmlns:a="http://schemas.openxmlformats.org/drawingml/2006/main" noChangeAspect="1"/>
             </wp:cNvGraphicFramePr>
@@ -3151,6 +3082,77 @@
                   <pic:spPr bwMode="auto">
                     <a:xfrm>
                       <a:off x="0" y="0"/>
+                      <a:ext cx="4095750" cy="4467225"/>
+                    </a:xfrm>
+                    <a:prstGeom prst="rect">
+                      <a:avLst/>
+                    </a:prstGeom>
+                  </pic:spPr>
+                </pic:pic>
+              </a:graphicData>
+            </a:graphic>
+          </wp:inline>
+        </w:drawing>
+      </w:r>
+    </w:p>
+    <w:p>
+      <w:pPr>
+        <w:spacing w:after="200"/>
+        <w:jc w:val="center"/>
+      </w:pPr>
+      <w:r>
+        <w:rPr>
+          <w:i/>
+          <w:iCs/>
+          <w:color w:val="595959"/>
+          <w:sz w:val="18"/>
+          <w:szCs w:val="18"/>
+        </w:rPr>
+        <w:t xml:space="preserve">Figura 3 — Recurso à camada semântica: sem correspondência textual, mostram-se obras por significado.</w:t>
+      </w:r>
+    </w:p>
+    <w:p>
+      <w:pPr>
+        <w:spacing w:after="120" w:line="360"/>
+        <w:jc w:val="both"/>
+      </w:pPr>
+      <w:r>
+        <w:t xml:space="preserve">A biblioteca apresenta o acervo organizado pelas secções da Classificação Decimal Universal (CDU), com contagem de obras por secção e subdivisão da Literatura por género.</w:t>
+      </w:r>
+    </w:p>
+    <w:p>
+      <w:pPr>
+        <w:spacing w:after="40" w:before="120"/>
+        <w:jc w:val="center"/>
+      </w:pPr>
+      <w:r>
+        <w:drawing>
+          <wp:inline distT="0" distB="0" distL="0" distR="0">
+            <wp:extent cx="4667250" cy="3105150"/>
+            <wp:effectExtent t="0" r="0" b="0" l="0"/>
+            <wp:docPr id="1" name="biblioteca.png" descr="Figura 4 — Biblioteca (em produção) organizada pelas secções da CDU, com 55 obras no acervo." title="Figura 4 — Biblioteca (em produção) organizada pelas secções da CDU, com 55 obras no acervo."/>
+            <wp:cNvGraphicFramePr>
+              <a:graphicFrameLocks xmlns:a="http://schemas.openxmlformats.org/drawingml/2006/main" noChangeAspect="1"/>
+            </wp:cNvGraphicFramePr>
+            <a:graphic xmlns:a="http://schemas.openxmlformats.org/drawingml/2006/main">
+              <a:graphicData uri="http://schemas.openxmlformats.org/drawingml/2006/picture">
+                <pic:pic xmlns:pic="http://schemas.openxmlformats.org/drawingml/2006/picture">
+                  <pic:nvPicPr>
+                    <pic:cNvPr id="0" name="" descr=""/>
+                    <pic:cNvPicPr>
+                      <a:picLocks noChangeAspect="1" noChangeArrowheads="1"/>
+                    </pic:cNvPicPr>
+                  </pic:nvPicPr>
+                  <pic:blipFill>
+                    <a:blip r:embed="rId14" cstate="none"/>
+                    <a:srcRect/>
+                    <a:stretch>
+                      <a:fillRect/>
+                    </a:stretch>
+                  </pic:blipFill>
+                  <pic:spPr bwMode="auto">
+                    <a:xfrm>
+                      <a:off x="0" y="0"/>
                       <a:ext cx="4667250" cy="3105150"/>
                     </a:xfrm>
                     <a:prstGeom prst="rect">
@@ -3574,10 +3576,10 @@
       </w:r>
     </w:p>
     <w:sectPr>
-      <w:footerReference w:type="default" r:id="rId8"/>
+      <w:footerReference w:type="default" r:id="rId9"/>
       <w:pgSz w:w="12240" w:h="15840" w:orient="portrait"/>
       <w:pgMar w:top="1440" w:right="1440" w:bottom="1440" w:left="1440" w:header="708" w:footer="708" w:gutter="0"/>
-      <w:pgNumType w:start="1"/>
+      <w:pgNumType/>
       <w:docGrid w:linePitch="360"/>
     </w:sectPr>
   </w:body>
@@ -3627,34 +3629,44 @@
 
 <file path=word/footer1.xml><?xml version="1.0" encoding="utf-8"?>
 <w:ftr xmlns:wpc="http://schemas.microsoft.com/office/word/2010/wordprocessingCanvas" xmlns:mc="http://schemas.openxmlformats.org/markup-compatibility/2006" xmlns:o="urn:schemas-microsoft-com:office:office" xmlns:r="http://schemas.openxmlformats.org/officeDocument/2006/relationships" xmlns:m="http://schemas.openxmlformats.org/officeDocument/2006/math" xmlns:v="urn:schemas-microsoft-com:vml" xmlns:wp14="http://schemas.microsoft.com/office/word/2010/wordprocessingDrawing" xmlns:wp="http://schemas.openxmlformats.org/drawingml/2006/wordprocessingDrawing" xmlns:w10="urn:schemas-microsoft-com:office:word" xmlns:w="http://schemas.openxmlformats.org/wordprocessingml/2006/main" xmlns:w14="http://schemas.microsoft.com/office/word/2010/wordml" xmlns:w15="http://schemas.microsoft.com/office/word/2012/wordml" xmlns:wpg="http://schemas.microsoft.com/office/word/2010/wordprocessingGroup" xmlns:wpi="http://schemas.microsoft.com/office/word/2010/wordprocessingInk" xmlns:wne="http://schemas.microsoft.com/office/word/2006/wordml" xmlns:wps="http://schemas.microsoft.com/office/word/2010/wordprocessingShape">
-  <w:p/>
+  <w:p>
+    <w:pPr>
+      <w:spacing w:before="120"/>
+      <w:jc w:val="center"/>
+    </w:pPr>
+    <w:r>
+      <w:rPr>
+        <w:color w:val="000000"/>
+        <w:sz w:val="24"/>
+        <w:szCs w:val="24"/>
+      </w:rPr>
+      <w:fldChar w:fldCharType="begin"/>
+      <w:instrText xml:space="preserve">PAGE</w:instrText>
+      <w:fldChar w:fldCharType="separate"/>
+      <w:fldChar w:fldCharType="end"/>
+    </w:r>
+  </w:p>
 </w:ftr>
 </file>
 
 <file path=word/footer2.xml><?xml version="1.0" encoding="utf-8"?>
 <w:ftr xmlns:wpc="http://schemas.microsoft.com/office/word/2010/wordprocessingCanvas" xmlns:mc="http://schemas.openxmlformats.org/markup-compatibility/2006" xmlns:o="urn:schemas-microsoft-com:office:office" xmlns:r="http://schemas.openxmlformats.org/officeDocument/2006/relationships" xmlns:m="http://schemas.openxmlformats.org/officeDocument/2006/math" xmlns:v="urn:schemas-microsoft-com:vml" xmlns:wp14="http://schemas.microsoft.com/office/word/2010/wordprocessingDrawing" xmlns:wp="http://schemas.openxmlformats.org/drawingml/2006/wordprocessingDrawing" xmlns:w10="urn:schemas-microsoft-com:office:word" xmlns:w="http://schemas.openxmlformats.org/wordprocessingml/2006/main" xmlns:w14="http://schemas.microsoft.com/office/word/2010/wordml" xmlns:w15="http://schemas.microsoft.com/office/word/2012/wordml" xmlns:wpg="http://schemas.microsoft.com/office/word/2010/wordprocessingGroup" xmlns:wpi="http://schemas.microsoft.com/office/word/2010/wordprocessingInk" xmlns:wne="http://schemas.microsoft.com/office/word/2006/wordml" xmlns:wps="http://schemas.microsoft.com/office/word/2010/wordprocessingShape">
+  <w:p/>
+</w:ftr>
+</file>
+
+<file path=word/footer3.xml><?xml version="1.0" encoding="utf-8"?>
+<w:ftr xmlns:wpc="http://schemas.microsoft.com/office/word/2010/wordprocessingCanvas" xmlns:mc="http://schemas.openxmlformats.org/markup-compatibility/2006" xmlns:o="urn:schemas-microsoft-com:office:office" xmlns:r="http://schemas.openxmlformats.org/officeDocument/2006/relationships" xmlns:m="http://schemas.openxmlformats.org/officeDocument/2006/math" xmlns:v="urn:schemas-microsoft-com:vml" xmlns:wp14="http://schemas.microsoft.com/office/word/2010/wordprocessingDrawing" xmlns:wp="http://schemas.openxmlformats.org/drawingml/2006/wordprocessingDrawing" xmlns:w10="urn:schemas-microsoft-com:office:word" xmlns:w="http://schemas.openxmlformats.org/wordprocessingml/2006/main" xmlns:w14="http://schemas.microsoft.com/office/word/2010/wordml" xmlns:w15="http://schemas.microsoft.com/office/word/2012/wordml" xmlns:wpg="http://schemas.microsoft.com/office/word/2010/wordprocessingGroup" xmlns:wpi="http://schemas.microsoft.com/office/word/2010/wordprocessingInk" xmlns:wne="http://schemas.microsoft.com/office/word/2006/wordml" xmlns:wps="http://schemas.microsoft.com/office/word/2010/wordprocessingShape">
   <w:p>
     <w:pPr>
-      <w:pBdr>
-        <w:top w:val="single" w:color="BFBFBF" w:sz="4" w:space="6"/>
-      </w:pBdr>
+      <w:spacing w:before="120"/>
       <w:jc w:val="center"/>
     </w:pPr>
     <w:r>
       <w:rPr>
-        <w:color w:val="404040"/>
-        <w:sz w:val="20"/>
-        <w:szCs w:val="20"/>
-      </w:rPr>
-      <w:t xml:space="preserve">BASI — Semantic Academic Hub      Página </w:t>
-    </w:r>
-    <w:r>
-      <w:rPr>
-        <w:b/>
-        <w:bCs/>
-        <w:color w:val="1F3864"/>
-        <w:sz w:val="20"/>
-        <w:szCs w:val="20"/>
+        <w:color w:val="000000"/>
+        <w:sz w:val="24"/>
+        <w:szCs w:val="24"/>
       </w:rPr>
       <w:fldChar w:fldCharType="begin"/>
       <w:instrText xml:space="preserve">PAGE</w:instrText>

</xml_diff>

<commit_message>
docs: reforçar citações no texto (todas as 9 referências citadas)
Acrescenta marcações [n] ao longo das secções, ligando as afirmações às
referências bibliográficas. Passam a estar citadas no corpo as referências
[6] Fuseki, [7] FastAPI, [8] Next.js e [9] CDU, além das já existentes
[1]-[5]. Regenera DOCX e PDF.

Co-Authored-By: Claude Opus 4.7 <noreply@anthropic.com>
</commit_message>
<xml_diff>
--- a/docs/Relatorio_BASI.docx
+++ b/docs/Relatorio_BASI.docx
@@ -1723,7 +1723,7 @@
         <w:jc w:val="both"/>
       </w:pPr>
       <w:r>
-        <w:t xml:space="preserve">As relações entre indivíduos são modeladas como propriedades de objecto, com os axiomas OWL que habilitam a inferência. O excerto seguinte mostra as três propriedades fundamentais — transitiva, simétrica e inversa:</w:t>
+        <w:t xml:space="preserve">As relações entre indivíduos são modeladas como propriedades de objecto, com os axiomas OWL que habilitam a inferência [2][5]. O excerto seguinte mostra as três propriedades fundamentais — transitiva, simétrica e inversa:</w:t>
       </w:r>
     </w:p>
     <w:p>
@@ -1886,7 +1886,7 @@
         <w:jc w:val="both"/>
       </w:pPr>
       <w:r>
-        <w:t xml:space="preserve">A ontologia inclui ainda restrições OWL e classes inferidas: por owl:Restriction exige-se que cada Documento tenha pelo menos um autor (cardinalidade mínima 1); por owl:equivalentClass define-se DocumentoDeIA (qualquer documento cujo tema seja Inteligência Artificial ou um seu subtema) e ProfessorActivo (professor autor de pelo menos um documento). O axioma owl:AllDisjointClasses garante que um documento não pode ser, em simultâneo, Livro e Tese. A CDU é modelada como um skos:ConceptScheme, em que cada secção e género é um skos:Concept.</w:t>
+        <w:t xml:space="preserve">A ontologia inclui ainda restrições OWL e classes inferidas: por owl:Restriction exige-se que cada Documento tenha pelo menos um autor (cardinalidade mínima 1); por owl:equivalentClass define-se DocumentoDeIA (qualquer documento cujo tema seja Inteligência Artificial ou um seu subtema) e ProfessorActivo (professor autor de pelo menos um documento). O axioma owl:AllDisjointClasses garante que um documento não pode ser, em simultâneo, Livro e Tese. A CDU [9] é modelada como um skos:ConceptScheme [4], em que cada secção e género é um skos:Concept.</w:t>
       </w:r>
     </w:p>
     <w:p>
@@ -1903,7 +1903,7 @@
         <w:jc w:val="both"/>
       </w:pPr>
       <w:r>
-        <w:t xml:space="preserve">A base de conhecimento (rdf/dados_exemplo.ttl) materializa as instâncias (ABox): áreas científicas, uma hierarquia de temas com três níveis de profundidade, autores, doze documentos técnicos e as relações entre eles (autoria, tema, citações e obras relacionadas). Estes doze documentos formam o núcleo densamente ligado que sustenta a demonstração da inferência; o catálogo completo da aplicação reúne 55 obras (documentos técnicos e literatura de domínio público), todas classificadas pela CDU. No servidor Fuseki em produção estão carregados 493 triplos. O excerto abaixo ilustra como a hierarquia de temas e a classificação de um documento são declaradas em triplos RDF:</w:t>
+        <w:t xml:space="preserve">A base de conhecimento (rdf/dados_exemplo.ttl) materializa as instâncias (ABox): áreas científicas, uma hierarquia de temas com três níveis de profundidade, autores, doze documentos técnicos e as relações entre eles (autoria, tema, citações e obras relacionadas). Estes doze documentos formam o núcleo densamente ligado que sustenta a demonstração da inferência; o catálogo completo da aplicação reúne 55 obras (documentos técnicos e literatura de domínio público), todas classificadas pela CDU. No servidor Fuseki [6] em produção estão carregados 493 triplos. O excerto abaixo ilustra como a hierarquia de temas e a classificação de um documento são declaradas em triplos RDF [1]:</w:t>
       </w:r>
     </w:p>
     <w:p>
@@ -2024,7 +2024,7 @@
         <w:jc w:val="both"/>
       </w:pPr>
       <w:r>
-        <w:t xml:space="preserve">A consulta-chave da pesquisa semântica usa um caminho de propriedade transitivo (eSubtemaDe*) para percorrer toda a sub-árvore de um tema e devolver os documentos a ele ligados, mesmo que o título não contenha a palavra pesquisada:</w:t>
+        <w:t xml:space="preserve">A consulta-chave da pesquisa semântica usa um caminho de propriedade transitivo (eSubtemaDe*) do SPARQL [3] para percorrer toda a sub-árvore de um tema e devolver os documentos a ele ligados, mesmo que o título não contenha a palavra pesquisada:</w:t>
       </w:r>
     </w:p>
     <w:p>
@@ -2550,7 +2550,7 @@
                 <w:b w:val="false"/>
                 <w:bCs w:val="false"/>
               </w:rPr>
-              <w:t xml:space="preserve">Next.js 14 (App Router), React, TypeScript, TailwindCSS</w:t>
+              <w:t xml:space="preserve">Next.js 14 (App Router), React, TypeScript, TailwindCSS [8]</w:t>
             </w:r>
           </w:p>
         </w:tc>
@@ -2607,7 +2607,7 @@
                 <w:b w:val="false"/>
                 <w:bCs w:val="false"/>
               </w:rPr>
-              <w:t xml:space="preserve">Python, FastAPI, Pydantic, SQLAlchemy 2.0</w:t>
+              <w:t xml:space="preserve">Python, FastAPI, Pydantic, SQLAlchemy 2.0 [7]</w:t>
             </w:r>
           </w:p>
         </w:tc>
@@ -2721,7 +2721,7 @@
                 <w:b w:val="false"/>
                 <w:bCs w:val="false"/>
               </w:rPr>
-              <w:t xml:space="preserve">Apache Jena Fuseki, rdflib, RDF, RDFS, OWL, SPARQL, SKOS</w:t>
+              <w:t xml:space="preserve">Apache Jena Fuseki [6], rdflib, RDF, RDFS, OWL, SPARQL, SKOS</w:t>
             </w:r>
           </w:p>
         </w:tc>
@@ -2868,7 +2868,7 @@
         <w:jc w:val="both"/>
       </w:pPr>
       <w:r>
-        <w:t xml:space="preserve">O backend, em FastAPI, está organizado em camadas (api/, services/, repositories/, models/, schemas/). O ServicoSemantico constrói e executa consultas SPARQL contra o Fuseki, com degradação graciosa: se o Fuseki estiver indisponível, recorre a um grafo rdflib em memória, mantendo a API a responder. O ServicoRecomendacoes combina sinais de conteúdo e de grafo. A documentação OpenAPI é gerada automaticamente em /docs.</w:t>
+        <w:t xml:space="preserve">O backend, em FastAPI [7], está organizado em camadas (api/, services/, repositories/, models/, schemas/). O ServicoSemantico constrói e executa consultas SPARQL [3] contra o Fuseki [6], com degradação graciosa: se o Fuseki estiver indisponível, recorre a um grafo rdflib em memória, mantendo a API a responder. O ServicoRecomendacoes combina sinais de conteúdo e de grafo. A documentação OpenAPI é gerada automaticamente em /docs.</w:t>
       </w:r>
     </w:p>
     <w:p>
@@ -2885,7 +2885,7 @@
         <w:jc w:val="both"/>
       </w:pPr>
       <w:r>
-        <w:t xml:space="preserve">O frontend, em Next.js 14 com TypeScript e TailwindCSS, concentra as chamadas num cliente HTTP central (lib/api.ts) que gere os tokens; o contexto de autenticação (lib/auth.tsx) protege as rotas. A página de destaque é a de pesquisa semântica, que mostra os termos expandidos para tornar a inferência transparente ao utilizador. A biblioteca é apresentada por secções da CDU, à semelhança das estantes de uma biblioteca física.</w:t>
+        <w:t xml:space="preserve">O frontend, em Next.js 14 [8] com TypeScript e TailwindCSS, concentra as chamadas num cliente HTTP central (lib/api.ts) que gere os tokens; o contexto de autenticação (lib/auth.tsx) protege as rotas. A página de destaque é a de pesquisa semântica, que mostra os termos expandidos para tornar a inferência transparente ao utilizador. A biblioteca é apresentada por secções da CDU [9], à semelhança das estantes de uma biblioteca física.</w:t>
       </w:r>
     </w:p>
     <w:p>

</xml_diff>

<commit_message>
docs: explicar no relatório como as pesquisas semânticas se associam
Adiciona a subsecção 7.1 "Como as pesquisas se associam entre si" com os
três tipos de relação (eSubtemaDe, temTema, obraRelacionada), um diagrama
da hierarquia de temas e a cadeia termo→tema→subtemas→documentos→obras.

Co-Authored-By: Claude Opus 4.7 <noreply@anthropic.com>
</commit_message>
<xml_diff>
--- a/docs/Relatorio_BASI.docx
+++ b/docs/Relatorio_BASI.docx
@@ -2290,6 +2290,227 @@
     </w:p>
     <w:p>
       <w:pPr>
+        <w:pStyle w:val="Heading2"/>
+      </w:pPr>
+      <w:r>
+        <w:t xml:space="preserve">7.1 Como as pesquisas se associam entre si</w:t>
+      </w:r>
+    </w:p>
+    <w:p>
+      <w:pPr>
+        <w:spacing w:after="120" w:line="360"/>
+        <w:jc w:val="both"/>
+      </w:pPr>
+      <w:r>
+        <w:t xml:space="preserve">Uma pesquisa não devolve apenas a obra cujo título ou autor corresponde literalmente ao termo: o sistema liga cada termo a um tema do grafo e, a partir daí, percorre as relações entre temas para descobrir todas as obras associadas. São três os tipos de relação que tornam as pesquisas dependentes umas das outras:</w:t>
+      </w:r>
+    </w:p>
+    <w:p>
+      <w:pPr>
+        <w:pStyle w:val="ListParagraph"/>
+        <w:numPr>
+          <w:ilvl w:val="0"/>
+          <w:numId w:val="2"/>
+        </w:numPr>
+        <w:spacing w:after="60" w:line="360"/>
+      </w:pPr>
+      <w:r>
+        <w:rPr>
+          <w:b/>
+          <w:bCs/>
+        </w:rPr>
+        <w:t xml:space="preserve">Tema → subtema </w:t>
+      </w:r>
+      <w:r>
+        <w:t xml:space="preserve">(basi:eSubtemaDe, transitiva): liga um tema aos seus temas mais específicos. Pesquisar um tema associa automaticamente todos os seus descendentes [3].</w:t>
+      </w:r>
+    </w:p>
+    <w:p>
+      <w:pPr>
+        <w:pStyle w:val="ListParagraph"/>
+        <w:numPr>
+          <w:ilvl w:val="0"/>
+          <w:numId w:val="2"/>
+        </w:numPr>
+        <w:spacing w:after="60" w:line="360"/>
+      </w:pPr>
+      <w:r>
+        <w:rPr>
+          <w:b/>
+          <w:bCs/>
+        </w:rPr>
+        <w:t xml:space="preserve">Documento → tema </w:t>
+      </w:r>
+      <w:r>
+        <w:t xml:space="preserve">(basi:temTema): liga cada obra aos temas que aborda; é a ponte entre a pesquisa por tema e as obras concretas.</w:t>
+      </w:r>
+    </w:p>
+    <w:p>
+      <w:pPr>
+        <w:pStyle w:val="ListParagraph"/>
+        <w:numPr>
+          <w:ilvl w:val="0"/>
+          <w:numId w:val="2"/>
+        </w:numPr>
+        <w:spacing w:after="60" w:line="360"/>
+      </w:pPr>
+      <w:r>
+        <w:rPr>
+          <w:b/>
+          <w:bCs/>
+        </w:rPr>
+        <w:t xml:space="preserve">Obra ↔ obra </w:t>
+      </w:r>
+      <w:r>
+        <w:t xml:space="preserve">(basi:obraRelacionada, simétrica): liga directamente obras afins, reforçando as recomendações.</w:t>
+      </w:r>
+    </w:p>
+    <w:p>
+      <w:pPr>
+        <w:spacing w:after="120" w:line="360"/>
+        <w:jc w:val="both"/>
+      </w:pPr>
+      <w:r>
+        <w:t xml:space="preserve">O grafo de temas em torno de «Inteligência Artificial» tem a forma seguinte — e é esta estrutura que explica por que razão uma pesquisa por IA também encontra obras de Deep Learning ou de Big Data, ainda que estas palavras não constem do termo procurado:</w:t>
+      </w:r>
+    </w:p>
+    <w:p>
+      <w:pPr>
+        <w:shd w:fill="F2F2F2" w:val="clear"/>
+        <w:spacing w:after="0"/>
+      </w:pPr>
+      <w:r>
+        <w:rPr>
+          <w:rFonts w:ascii="Consolas" w:cs="Consolas" w:eastAsia="Consolas" w:hAnsi="Consolas"/>
+          <w:sz w:val="18"/>
+          <w:szCs w:val="18"/>
+        </w:rPr>
+        <w:t xml:space="preserve">Inteligência Artificial</w:t>
+      </w:r>
+    </w:p>
+    <w:p>
+      <w:pPr>
+        <w:shd w:fill="F2F2F2" w:val="clear"/>
+        <w:spacing w:after="0"/>
+      </w:pPr>
+      <w:r>
+        <w:rPr>
+          <w:rFonts w:ascii="Consolas" w:cs="Consolas" w:eastAsia="Consolas" w:hAnsi="Consolas"/>
+          <w:sz w:val="18"/>
+          <w:szCs w:val="18"/>
+        </w:rPr>
+        <w:t xml:space="preserve">├── Machine Learning</w:t>
+      </w:r>
+    </w:p>
+    <w:p>
+      <w:pPr>
+        <w:shd w:fill="F2F2F2" w:val="clear"/>
+        <w:spacing w:after="0"/>
+      </w:pPr>
+      <w:r>
+        <w:rPr>
+          <w:rFonts w:ascii="Consolas" w:cs="Consolas" w:eastAsia="Consolas" w:hAnsi="Consolas"/>
+          <w:sz w:val="18"/>
+          <w:szCs w:val="18"/>
+        </w:rPr>
+        <w:t xml:space="preserve">│   ├── Deep Learning</w:t>
+      </w:r>
+    </w:p>
+    <w:p>
+      <w:pPr>
+        <w:shd w:fill="F2F2F2" w:val="clear"/>
+        <w:spacing w:after="0"/>
+      </w:pPr>
+      <w:r>
+        <w:rPr>
+          <w:rFonts w:ascii="Consolas" w:cs="Consolas" w:eastAsia="Consolas" w:hAnsi="Consolas"/>
+          <w:sz w:val="18"/>
+          <w:szCs w:val="18"/>
+        </w:rPr>
+        <w:t xml:space="preserve">│   ├── Redes Neurais</w:t>
+      </w:r>
+    </w:p>
+    <w:p>
+      <w:pPr>
+        <w:shd w:fill="F2F2F2" w:val="clear"/>
+        <w:spacing w:after="0"/>
+      </w:pPr>
+      <w:r>
+        <w:rPr>
+          <w:rFonts w:ascii="Consolas" w:cs="Consolas" w:eastAsia="Consolas" w:hAnsi="Consolas"/>
+          <w:sz w:val="18"/>
+          <w:szCs w:val="18"/>
+        </w:rPr>
+        <w:t xml:space="preserve">│   └── Aprendizagem por Reforço</w:t>
+      </w:r>
+    </w:p>
+    <w:p>
+      <w:pPr>
+        <w:shd w:fill="F2F2F2" w:val="clear"/>
+        <w:spacing w:after="0"/>
+      </w:pPr>
+      <w:r>
+        <w:rPr>
+          <w:rFonts w:ascii="Consolas" w:cs="Consolas" w:eastAsia="Consolas" w:hAnsi="Consolas"/>
+          <w:sz w:val="18"/>
+          <w:szCs w:val="18"/>
+        </w:rPr>
+        <w:t xml:space="preserve">├── Ciência de Dados</w:t>
+      </w:r>
+    </w:p>
+    <w:p>
+      <w:pPr>
+        <w:shd w:fill="F2F2F2" w:val="clear"/>
+        <w:spacing w:after="0"/>
+      </w:pPr>
+      <w:r>
+        <w:rPr>
+          <w:rFonts w:ascii="Consolas" w:cs="Consolas" w:eastAsia="Consolas" w:hAnsi="Consolas"/>
+          <w:sz w:val="18"/>
+          <w:szCs w:val="18"/>
+        </w:rPr>
+        <w:t xml:space="preserve">│   └── Big Data</w:t>
+      </w:r>
+    </w:p>
+    <w:p>
+      <w:pPr>
+        <w:shd w:fill="F2F2F2" w:val="clear"/>
+        <w:spacing w:after="0"/>
+      </w:pPr>
+      <w:r>
+        <w:rPr>
+          <w:rFonts w:ascii="Consolas" w:cs="Consolas" w:eastAsia="Consolas" w:hAnsi="Consolas"/>
+          <w:sz w:val="18"/>
+          <w:szCs w:val="18"/>
+        </w:rPr>
+        <w:t xml:space="preserve">├── Visão Computacional</w:t>
+      </w:r>
+    </w:p>
+    <w:p>
+      <w:pPr>
+        <w:shd w:fill="F2F2F2" w:val="clear"/>
+        <w:spacing w:after="120"/>
+      </w:pPr>
+      <w:r>
+        <w:rPr>
+          <w:rFonts w:ascii="Consolas" w:cs="Consolas" w:eastAsia="Consolas" w:hAnsi="Consolas"/>
+          <w:sz w:val="18"/>
+          <w:szCs w:val="18"/>
+        </w:rPr>
+        <w:t xml:space="preserve">└── Processamento de Linguagem Natural</w:t>
+      </w:r>
+    </w:p>
+    <w:p>
+      <w:pPr>
+        <w:spacing w:after="120" w:line="360"/>
+        <w:jc w:val="both"/>
+      </w:pPr>
+      <w:r>
+        <w:t xml:space="preserve">A relação entre pesquisas é, assim, explícita e navegável: «Big Data» é subtema de «Ciência de Dados», que por sua vez é subtema de «Inteligência Artificial». Uma pesquisa por qualquer um destes termos associa-se aos restantes através do caminho eSubtemaDe*, e cada resultado indica o tema que o tornou relevante — tornando visível a ligação entre a pesquisa e a obra encontrada. É esta cadeia de relações (termo → tema → subtemas → documentos → obras relacionadas) que distingue a pesquisa semântica de uma simples pesquisa por título ou autor.</w:t>
+      </w:r>
+    </w:p>
+    <w:p>
+      <w:pPr>
         <w:pStyle w:val="Heading1"/>
       </w:pPr>
       <w:r>

</xml_diff>